<commit_message>
nmv 21 05 2026
</commit_message>
<xml_diff>
--- a/TS Jatai Ghanam Project/TS 1.8/TS 1.8 Jatai Malayalam Corrections.docx
+++ b/TS Jatai Ghanam Project/TS 1.8/TS 1.8 Jatai Malayalam Corrections.docx
@@ -42,7 +42,18 @@
           <w:szCs w:val="32"/>
           <w:u w:val="single"/>
         </w:rPr>
-        <w:t xml:space="preserve"> – TS 1.8 Malayalam Corrections – Observed till </w:t>
+        <w:t xml:space="preserve"> – TS 1.8 Malayalam Corrections – Observed </w:t>
+      </w:r>
+      <w:proofErr w:type="gramStart"/>
+      <w:r>
+        <w:rPr>
+          <w:b/>
+          <w:bCs/>
+          <w:sz w:val="32"/>
+          <w:szCs w:val="32"/>
+          <w:u w:val="single"/>
+        </w:rPr>
+        <w:t xml:space="preserve">till </w:t>
       </w:r>
       <w:r>
         <w:rPr>
@@ -55,6 +66,7 @@
         </w:rPr>
         <w:t>????</w:t>
       </w:r>
+      <w:proofErr w:type="gramEnd"/>
     </w:p>
     <w:p>
       <w:pPr>
@@ -148,7 +160,7 @@
       </w:tr>
       <w:tr>
         <w:trPr>
-          <w:trHeight w:val="1338"/>
+          <w:trHeight w:val="1055"/>
         </w:trPr>
         <w:tc>
           <w:tcPr>
@@ -160,10 +172,9 @@
               <w:autoSpaceDE w:val="0"/>
               <w:autoSpaceDN w:val="0"/>
               <w:adjustRightInd w:val="0"/>
-              <w:spacing w:line="240" w:lineRule="auto"/>
-              <w:rPr>
-                <w:rFonts w:ascii="BRH Malayalam Extra" w:hAnsi="BRH Malayalam Extra" w:cs="BRH Malayalam Extra"/>
-                <w:color w:val="000000"/>
+              <w:spacing w:before="0" w:line="240" w:lineRule="auto"/>
+              <w:rPr>
+                <w:rFonts w:ascii="BRH Malayalam Extra" w:hAnsi="BRH Malayalam Extra" w:cs="BRH Malayalam Extra"/>
                 <w:sz w:val="32"/>
                 <w:szCs w:val="40"/>
               </w:rPr>
@@ -171,15 +182,13 @@
             <w:r>
               <w:rPr>
                 <w:rFonts w:cs="BRH Malayalam Extra"/>
-                <w:color w:val="000000"/>
-                <w:szCs w:val="40"/>
-              </w:rPr>
-              <w:t>32</w:t>
-            </w:r>
-            <w:r>
-              <w:rPr>
-                <w:rFonts w:ascii="BRH Malayalam Extra" w:hAnsi="BRH Malayalam Extra" w:cs="BRH Malayalam Extra"/>
-                <w:color w:val="000000"/>
+                <w:szCs w:val="40"/>
+              </w:rPr>
+              <w:t>22</w:t>
+            </w:r>
+            <w:r>
+              <w:rPr>
+                <w:rFonts w:ascii="BRH Malayalam Extra" w:hAnsi="BRH Malayalam Extra" w:cs="BRH Malayalam Extra"/>
                 <w:sz w:val="32"/>
                 <w:szCs w:val="40"/>
               </w:rPr>
@@ -188,7 +197,6 @@
             <w:r>
               <w:rPr>
                 <w:rFonts w:ascii="BRH Malayalam Extra" w:hAnsi="BRH Malayalam Extra" w:cs="BRH Malayalam Extra"/>
-                <w:color w:val="000000"/>
                 <w:sz w:val="32"/>
                 <w:szCs w:val="40"/>
               </w:rPr>
@@ -197,7 +205,6 @@
             <w:r>
               <w:rPr>
                 <w:rFonts w:cs="BRH Malayalam Extra"/>
-                <w:color w:val="000000"/>
                 <w:szCs w:val="40"/>
               </w:rPr>
               <w:t>1</w:t>
@@ -205,7 +212,6 @@
             <w:r>
               <w:rPr>
                 <w:rFonts w:ascii="BRH Malayalam Extra" w:hAnsi="BRH Malayalam Extra" w:cs="BRH Malayalam Extra"/>
-                <w:color w:val="000000"/>
                 <w:sz w:val="32"/>
                 <w:szCs w:val="40"/>
               </w:rPr>
@@ -214,7 +220,6 @@
             <w:r>
               <w:rPr>
                 <w:rFonts w:cs="BRH Malayalam Extra"/>
-                <w:color w:val="000000"/>
                 <w:szCs w:val="40"/>
               </w:rPr>
               <w:t>8</w:t>
@@ -222,7 +227,6 @@
             <w:r>
               <w:rPr>
                 <w:rFonts w:ascii="BRH Malayalam Extra" w:hAnsi="BRH Malayalam Extra" w:cs="BRH Malayalam Extra"/>
-                <w:color w:val="000000"/>
                 <w:sz w:val="32"/>
                 <w:szCs w:val="40"/>
               </w:rPr>
@@ -231,15 +235,13 @@
             <w:r>
               <w:rPr>
                 <w:rFonts w:cs="BRH Malayalam Extra"/>
-                <w:color w:val="000000"/>
-                <w:szCs w:val="40"/>
-              </w:rPr>
-              <w:t>22</w:t>
-            </w:r>
-            <w:r>
-              <w:rPr>
-                <w:rFonts w:ascii="BRH Malayalam Extra" w:hAnsi="BRH Malayalam Extra" w:cs="BRH Malayalam Extra"/>
-                <w:color w:val="000000"/>
+                <w:szCs w:val="40"/>
+              </w:rPr>
+              <w:t>3</w:t>
+            </w:r>
+            <w:r>
+              <w:rPr>
+                <w:rFonts w:ascii="BRH Malayalam Extra" w:hAnsi="BRH Malayalam Extra" w:cs="BRH Malayalam Extra"/>
                 <w:sz w:val="32"/>
                 <w:szCs w:val="40"/>
               </w:rPr>
@@ -248,15 +250,13 @@
             <w:r>
               <w:rPr>
                 <w:rFonts w:cs="BRH Malayalam Extra"/>
-                <w:color w:val="000000"/>
-                <w:szCs w:val="40"/>
-              </w:rPr>
-              <w:t>5</w:t>
-            </w:r>
-            <w:r>
-              <w:rPr>
-                <w:rFonts w:ascii="BRH Malayalam Extra" w:hAnsi="BRH Malayalam Extra" w:cs="BRH Malayalam Extra"/>
-                <w:color w:val="000000"/>
+                <w:szCs w:val="40"/>
+              </w:rPr>
+              <w:t>1</w:t>
+            </w:r>
+            <w:r>
+              <w:rPr>
+                <w:rFonts w:ascii="BRH Malayalam Extra" w:hAnsi="BRH Malayalam Extra" w:cs="BRH Malayalam Extra"/>
                 <w:sz w:val="32"/>
                 <w:szCs w:val="40"/>
               </w:rPr>
@@ -265,37 +265,51 @@
             <w:r>
               <w:rPr>
                 <w:rFonts w:cs="BRH Malayalam Extra"/>
-                <w:color w:val="000000"/>
-                <w:szCs w:val="40"/>
-              </w:rPr>
-              <w:t>29</w:t>
-            </w:r>
-            <w:r>
-              <w:rPr>
-                <w:rFonts w:ascii="BRH Malayalam Extra" w:hAnsi="BRH Malayalam Extra" w:cs="BRH Malayalam Extra"/>
-                <w:color w:val="000000"/>
-                <w:sz w:val="32"/>
-                <w:szCs w:val="40"/>
-              </w:rPr>
-              <w:t>)-  A</w:t>
-            </w:r>
-            <w:r>
-              <w:rPr>
-                <w:rFonts w:ascii="BRH Malayalam Extra" w:hAnsi="BRH Malayalam Extra" w:cs="BRH Malayalam Extra"/>
-                <w:color w:val="000000"/>
-                <w:sz w:val="26"/>
-                <w:szCs w:val="40"/>
-              </w:rPr>
-              <w:t>–</w:t>
-            </w:r>
-            <w:r>
-              <w:rPr>
-                <w:rFonts w:ascii="BRH Malayalam Extra" w:hAnsi="BRH Malayalam Extra" w:cs="BRH Malayalam Extra"/>
-                <w:color w:val="000000"/>
-                <w:sz w:val="32"/>
-                <w:szCs w:val="40"/>
-              </w:rPr>
-              <w:t>¥sô | pyqûx˜ |</w:t>
+                <w:szCs w:val="40"/>
+              </w:rPr>
+              <w:t>16</w:t>
+            </w:r>
+            <w:r>
+              <w:rPr>
+                <w:rFonts w:ascii="BRH Malayalam Extra" w:hAnsi="BRH Malayalam Extra" w:cs="BRH Malayalam Extra"/>
+                <w:sz w:val="32"/>
+                <w:szCs w:val="40"/>
+              </w:rPr>
+              <w:t>)</w:t>
+            </w:r>
+            <w:proofErr w:type="gramStart"/>
+            <w:r>
+              <w:rPr>
+                <w:rFonts w:ascii="BRH Malayalam Extra" w:hAnsi="BRH Malayalam Extra" w:cs="BRH Malayalam Extra"/>
+                <w:sz w:val="32"/>
+                <w:szCs w:val="40"/>
+              </w:rPr>
+              <w:t>-  s</w:t>
+            </w:r>
+            <w:proofErr w:type="gramEnd"/>
+            <w:r>
+              <w:rPr>
+                <w:rFonts w:ascii="BRH Malayalam Extra" w:hAnsi="BRH Malayalam Extra" w:cs="BRH Malayalam Extra"/>
+                <w:sz w:val="32"/>
+                <w:szCs w:val="40"/>
+              </w:rPr>
+              <w:t>¡ | d</w:t>
+            </w:r>
+            <w:r>
+              <w:rPr>
+                <w:rFonts w:ascii="BRH Malayalam Extra" w:hAnsi="BRH Malayalam Extra" w:cs="BRH Malayalam Extra"/>
+                <w:sz w:val="26"/>
+                <w:szCs w:val="40"/>
+              </w:rPr>
+              <w:t>–</w:t>
+            </w:r>
+            <w:r>
+              <w:rPr>
+                <w:rFonts w:ascii="BRH Malayalam Extra" w:hAnsi="BRH Malayalam Extra" w:cs="BRH Malayalam Extra"/>
+                <w:sz w:val="32"/>
+                <w:szCs w:val="40"/>
+              </w:rPr>
+              <w:t xml:space="preserve">J | </w:t>
             </w:r>
           </w:p>
           <w:p>
@@ -304,138 +318,71 @@
               <w:autoSpaceDE w:val="0"/>
               <w:autoSpaceDN w:val="0"/>
               <w:adjustRightInd w:val="0"/>
-              <w:spacing w:line="240" w:lineRule="auto"/>
-              <w:rPr>
-                <w:rFonts w:ascii="BRH Malayalam Extra" w:hAnsi="BRH Malayalam Extra" w:cs="BRH Malayalam Extra"/>
+              <w:spacing w:before="0" w:line="240" w:lineRule="auto"/>
+              <w:rPr>
+                <w:rFonts w:cs="BRH Malayalam Extra"/>
                 <w:color w:val="000000"/>
-                <w:sz w:val="32"/>
                 <w:szCs w:val="40"/>
               </w:rPr>
             </w:pPr>
             <w:r>
               <w:rPr>
                 <w:rFonts w:ascii="BRH Malayalam Extra" w:hAnsi="BRH Malayalam Extra" w:cs="BRH Malayalam Extra"/>
-                <w:color w:val="000000"/>
-                <w:sz w:val="32"/>
-                <w:szCs w:val="40"/>
-              </w:rPr>
-              <w:t>A</w:t>
-            </w:r>
-            <w:r>
-              <w:rPr>
-                <w:rFonts w:ascii="BRH Malayalam Extra" w:hAnsi="BRH Malayalam Extra" w:cs="BRH Malayalam Extra"/>
-                <w:color w:val="000000"/>
-                <w:sz w:val="26"/>
-                <w:szCs w:val="40"/>
-              </w:rPr>
-              <w:t>–</w:t>
-            </w:r>
-            <w:r>
-              <w:rPr>
-                <w:rFonts w:ascii="BRH Malayalam Extra" w:hAnsi="BRH Malayalam Extra" w:cs="BRH Malayalam Extra"/>
-                <w:color w:val="000000"/>
-                <w:sz w:val="32"/>
-                <w:szCs w:val="40"/>
-              </w:rPr>
-              <w:t>¥sô pyqûx</w:t>
-            </w:r>
-            <w:r>
-              <w:rPr>
-                <w:rFonts w:ascii="BRH Malayalam Extra" w:hAnsi="BRH Malayalam Extra" w:cs="BRH Malayalam Extra"/>
-                <w:color w:val="000000"/>
-                <w:sz w:val="26"/>
-                <w:szCs w:val="40"/>
-              </w:rPr>
-              <w:t>–</w:t>
-            </w:r>
-            <w:r>
-              <w:rPr>
-                <w:rFonts w:ascii="BRH Malayalam Extra" w:hAnsi="BRH Malayalam Extra" w:cs="BRH Malayalam Extra"/>
-                <w:color w:val="000000"/>
-                <w:sz w:val="32"/>
-                <w:szCs w:val="40"/>
-              </w:rPr>
-              <w:t xml:space="preserve"> py</w:t>
-            </w:r>
-            <w:r>
-              <w:rPr>
-                <w:rFonts w:ascii="BRH Malayalam Extra" w:hAnsi="BRH Malayalam Extra" w:cs="BRH Malayalam Extra"/>
-                <w:color w:val="000000"/>
+                <w:sz w:val="32"/>
+                <w:szCs w:val="40"/>
+              </w:rPr>
+              <w:t>s</w:t>
+            </w:r>
+            <w:r>
+              <w:rPr>
+                <w:rFonts w:ascii="BRH Malayalam Extra" w:hAnsi="BRH Malayalam Extra" w:cs="BRH Malayalam Extra"/>
                 <w:sz w:val="32"/>
                 <w:szCs w:val="40"/>
                 <w:highlight w:val="yellow"/>
               </w:rPr>
-              <w:t>qûx</w:t>
-            </w:r>
-            <w:r>
-              <w:rPr>
-                <w:rFonts w:ascii="BRH Malayalam Extra" w:hAnsi="BRH Malayalam Extra" w:cs="BRH Malayalam Extra"/>
-                <w:color w:val="000000"/>
-                <w:sz w:val="32"/>
-                <w:szCs w:val="40"/>
-              </w:rPr>
-              <w:t xml:space="preserve">— </w:t>
-            </w:r>
-            <w:r>
-              <w:rPr>
-                <w:rFonts w:ascii="BRH Malayalam Extra" w:hAnsi="BRH Malayalam Extra" w:cs="BRH Malayalam Extra"/>
-                <w:color w:val="000000"/>
+              <w:t>¡</w:t>
+            </w:r>
+            <w:r>
+              <w:rPr>
+                <w:rFonts w:ascii="BRH Malayalam Extra" w:hAnsi="BRH Malayalam Extra" w:cs="BRH Malayalam Extra"/>
+                <w:sz w:val="32"/>
+                <w:szCs w:val="40"/>
+              </w:rPr>
+              <w:t xml:space="preserve"> ¥dx— d</w:t>
+            </w:r>
+            <w:r>
+              <w:rPr>
+                <w:rFonts w:ascii="BRH Malayalam Extra" w:hAnsi="BRH Malayalam Extra" w:cs="BRH Malayalam Extra"/>
+                <w:sz w:val="26"/>
+                <w:szCs w:val="40"/>
+              </w:rPr>
+              <w:t>–</w:t>
+            </w:r>
+            <w:r>
+              <w:rPr>
+                <w:rFonts w:ascii="BRH Malayalam Extra" w:hAnsi="BRH Malayalam Extra" w:cs="BRH Malayalam Extra"/>
+                <w:sz w:val="32"/>
+                <w:szCs w:val="40"/>
+              </w:rPr>
+              <w:t>J s¡ s</w:t>
+            </w:r>
+            <w:r>
+              <w:rPr>
+                <w:rFonts w:ascii="BRH Malayalam Extra" w:hAnsi="BRH Malayalam Extra" w:cs="BRH Malayalam Extra"/>
                 <w:sz w:val="32"/>
                 <w:szCs w:val="40"/>
                 <w:highlight w:val="yellow"/>
               </w:rPr>
-              <w:t>A</w:t>
-            </w:r>
-            <w:r>
-              <w:rPr>
-                <w:rFonts w:ascii="BRH Malayalam Extra" w:hAnsi="BRH Malayalam Extra" w:cs="BRH Malayalam Extra"/>
-                <w:color w:val="000000"/>
-                <w:sz w:val="26"/>
-                <w:szCs w:val="40"/>
-              </w:rPr>
-              <w:t>–</w:t>
-            </w:r>
-            <w:r>
-              <w:rPr>
-                <w:rFonts w:ascii="BRH Malayalam Extra" w:hAnsi="BRH Malayalam Extra" w:cs="BRH Malayalam Extra"/>
-                <w:color w:val="000000"/>
-                <w:sz w:val="32"/>
-                <w:szCs w:val="40"/>
-              </w:rPr>
-              <w:t>¥sô A</w:t>
-            </w:r>
-            <w:r>
-              <w:rPr>
-                <w:rFonts w:ascii="BRH Malayalam Extra" w:hAnsi="BRH Malayalam Extra" w:cs="BRH Malayalam Extra"/>
-                <w:color w:val="000000"/>
-                <w:sz w:val="26"/>
-                <w:szCs w:val="40"/>
-              </w:rPr>
-              <w:t>–</w:t>
-            </w:r>
-            <w:r>
-              <w:rPr>
-                <w:rFonts w:ascii="BRH Malayalam Extra" w:hAnsi="BRH Malayalam Extra" w:cs="BRH Malayalam Extra"/>
-                <w:color w:val="000000"/>
-                <w:sz w:val="32"/>
-                <w:szCs w:val="40"/>
-              </w:rPr>
-              <w:t xml:space="preserve">¥sô pyqûx˜ | </w:t>
-            </w:r>
-          </w:p>
-          <w:p>
-            <w:pPr>
-              <w:widowControl w:val="0"/>
-              <w:autoSpaceDE w:val="0"/>
-              <w:autoSpaceDN w:val="0"/>
-              <w:adjustRightInd w:val="0"/>
-              <w:spacing w:line="240" w:lineRule="auto"/>
-              <w:rPr>
-                <w:rFonts w:cs="BRH Malayalam Extra"/>
-                <w:color w:val="000000"/>
-                <w:szCs w:val="40"/>
-              </w:rPr>
-            </w:pPr>
+              <w:t>¡</w:t>
+            </w:r>
+            <w:r>
+              <w:rPr>
+                <w:rFonts w:ascii="BRH Malayalam Extra" w:hAnsi="BRH Malayalam Extra" w:cs="BRH Malayalam Extra"/>
+                <w:sz w:val="32"/>
+                <w:szCs w:val="40"/>
+              </w:rPr>
+              <w:t xml:space="preserve"> d—J | </w:t>
+            </w:r>
           </w:p>
         </w:tc>
         <w:tc>
@@ -448,10 +395,9 @@
               <w:autoSpaceDE w:val="0"/>
               <w:autoSpaceDN w:val="0"/>
               <w:adjustRightInd w:val="0"/>
-              <w:spacing w:line="240" w:lineRule="auto"/>
-              <w:rPr>
-                <w:rFonts w:ascii="BRH Malayalam Extra" w:hAnsi="BRH Malayalam Extra" w:cs="BRH Malayalam Extra"/>
-                <w:color w:val="000000"/>
+              <w:spacing w:before="0" w:line="240" w:lineRule="auto"/>
+              <w:rPr>
+                <w:rFonts w:ascii="BRH Malayalam Extra" w:hAnsi="BRH Malayalam Extra" w:cs="BRH Malayalam Extra"/>
                 <w:sz w:val="32"/>
                 <w:szCs w:val="40"/>
               </w:rPr>
@@ -459,15 +405,13 @@
             <w:r>
               <w:rPr>
                 <w:rFonts w:cs="BRH Malayalam Extra"/>
-                <w:color w:val="000000"/>
-                <w:szCs w:val="40"/>
-              </w:rPr>
-              <w:t>32</w:t>
-            </w:r>
-            <w:r>
-              <w:rPr>
-                <w:rFonts w:ascii="BRH Malayalam Extra" w:hAnsi="BRH Malayalam Extra" w:cs="BRH Malayalam Extra"/>
-                <w:color w:val="000000"/>
+                <w:szCs w:val="40"/>
+              </w:rPr>
+              <w:t>22</w:t>
+            </w:r>
+            <w:r>
+              <w:rPr>
+                <w:rFonts w:ascii="BRH Malayalam Extra" w:hAnsi="BRH Malayalam Extra" w:cs="BRH Malayalam Extra"/>
                 <w:sz w:val="32"/>
                 <w:szCs w:val="40"/>
               </w:rPr>
@@ -476,7 +420,6 @@
             <w:r>
               <w:rPr>
                 <w:rFonts w:ascii="BRH Malayalam Extra" w:hAnsi="BRH Malayalam Extra" w:cs="BRH Malayalam Extra"/>
-                <w:color w:val="000000"/>
                 <w:sz w:val="32"/>
                 <w:szCs w:val="40"/>
               </w:rPr>
@@ -485,7 +428,6 @@
             <w:r>
               <w:rPr>
                 <w:rFonts w:cs="BRH Malayalam Extra"/>
-                <w:color w:val="000000"/>
                 <w:szCs w:val="40"/>
               </w:rPr>
               <w:t>1</w:t>
@@ -493,7 +435,6 @@
             <w:r>
               <w:rPr>
                 <w:rFonts w:ascii="BRH Malayalam Extra" w:hAnsi="BRH Malayalam Extra" w:cs="BRH Malayalam Extra"/>
-                <w:color w:val="000000"/>
                 <w:sz w:val="32"/>
                 <w:szCs w:val="40"/>
               </w:rPr>
@@ -502,7 +443,6 @@
             <w:r>
               <w:rPr>
                 <w:rFonts w:cs="BRH Malayalam Extra"/>
-                <w:color w:val="000000"/>
                 <w:szCs w:val="40"/>
               </w:rPr>
               <w:t>8</w:t>
@@ -510,7 +450,6 @@
             <w:r>
               <w:rPr>
                 <w:rFonts w:ascii="BRH Malayalam Extra" w:hAnsi="BRH Malayalam Extra" w:cs="BRH Malayalam Extra"/>
-                <w:color w:val="000000"/>
                 <w:sz w:val="32"/>
                 <w:szCs w:val="40"/>
               </w:rPr>
@@ -519,15 +458,13 @@
             <w:r>
               <w:rPr>
                 <w:rFonts w:cs="BRH Malayalam Extra"/>
-                <w:color w:val="000000"/>
-                <w:szCs w:val="40"/>
-              </w:rPr>
-              <w:t>22</w:t>
-            </w:r>
-            <w:r>
-              <w:rPr>
-                <w:rFonts w:ascii="BRH Malayalam Extra" w:hAnsi="BRH Malayalam Extra" w:cs="BRH Malayalam Extra"/>
-                <w:color w:val="000000"/>
+                <w:szCs w:val="40"/>
+              </w:rPr>
+              <w:t>3</w:t>
+            </w:r>
+            <w:r>
+              <w:rPr>
+                <w:rFonts w:ascii="BRH Malayalam Extra" w:hAnsi="BRH Malayalam Extra" w:cs="BRH Malayalam Extra"/>
                 <w:sz w:val="32"/>
                 <w:szCs w:val="40"/>
               </w:rPr>
@@ -536,15 +473,13 @@
             <w:r>
               <w:rPr>
                 <w:rFonts w:cs="BRH Malayalam Extra"/>
-                <w:color w:val="000000"/>
-                <w:szCs w:val="40"/>
-              </w:rPr>
-              <w:t>5</w:t>
-            </w:r>
-            <w:r>
-              <w:rPr>
-                <w:rFonts w:ascii="BRH Malayalam Extra" w:hAnsi="BRH Malayalam Extra" w:cs="BRH Malayalam Extra"/>
-                <w:color w:val="000000"/>
+                <w:szCs w:val="40"/>
+              </w:rPr>
+              <w:t>1</w:t>
+            </w:r>
+            <w:r>
+              <w:rPr>
+                <w:rFonts w:ascii="BRH Malayalam Extra" w:hAnsi="BRH Malayalam Extra" w:cs="BRH Malayalam Extra"/>
                 <w:sz w:val="32"/>
                 <w:szCs w:val="40"/>
               </w:rPr>
@@ -553,37 +488,51 @@
             <w:r>
               <w:rPr>
                 <w:rFonts w:cs="BRH Malayalam Extra"/>
-                <w:color w:val="000000"/>
-                <w:szCs w:val="40"/>
-              </w:rPr>
-              <w:t>29</w:t>
-            </w:r>
-            <w:r>
-              <w:rPr>
-                <w:rFonts w:ascii="BRH Malayalam Extra" w:hAnsi="BRH Malayalam Extra" w:cs="BRH Malayalam Extra"/>
-                <w:color w:val="000000"/>
-                <w:sz w:val="32"/>
-                <w:szCs w:val="40"/>
-              </w:rPr>
-              <w:t>)-  A</w:t>
-            </w:r>
-            <w:r>
-              <w:rPr>
-                <w:rFonts w:ascii="BRH Malayalam Extra" w:hAnsi="BRH Malayalam Extra" w:cs="BRH Malayalam Extra"/>
-                <w:color w:val="000000"/>
-                <w:sz w:val="26"/>
-                <w:szCs w:val="40"/>
-              </w:rPr>
-              <w:t>–</w:t>
-            </w:r>
-            <w:r>
-              <w:rPr>
-                <w:rFonts w:ascii="BRH Malayalam Extra" w:hAnsi="BRH Malayalam Extra" w:cs="BRH Malayalam Extra"/>
-                <w:color w:val="000000"/>
-                <w:sz w:val="32"/>
-                <w:szCs w:val="40"/>
-              </w:rPr>
-              <w:t>¥sô | pyqûx˜ |</w:t>
+                <w:szCs w:val="40"/>
+              </w:rPr>
+              <w:t>16</w:t>
+            </w:r>
+            <w:r>
+              <w:rPr>
+                <w:rFonts w:ascii="BRH Malayalam Extra" w:hAnsi="BRH Malayalam Extra" w:cs="BRH Malayalam Extra"/>
+                <w:sz w:val="32"/>
+                <w:szCs w:val="40"/>
+              </w:rPr>
+              <w:t>)</w:t>
+            </w:r>
+            <w:proofErr w:type="gramStart"/>
+            <w:r>
+              <w:rPr>
+                <w:rFonts w:ascii="BRH Malayalam Extra" w:hAnsi="BRH Malayalam Extra" w:cs="BRH Malayalam Extra"/>
+                <w:sz w:val="32"/>
+                <w:szCs w:val="40"/>
+              </w:rPr>
+              <w:t>-  s</w:t>
+            </w:r>
+            <w:proofErr w:type="gramEnd"/>
+            <w:r>
+              <w:rPr>
+                <w:rFonts w:ascii="BRH Malayalam Extra" w:hAnsi="BRH Malayalam Extra" w:cs="BRH Malayalam Extra"/>
+                <w:sz w:val="32"/>
+                <w:szCs w:val="40"/>
+              </w:rPr>
+              <w:t>¡ | d</w:t>
+            </w:r>
+            <w:r>
+              <w:rPr>
+                <w:rFonts w:ascii="BRH Malayalam Extra" w:hAnsi="BRH Malayalam Extra" w:cs="BRH Malayalam Extra"/>
+                <w:sz w:val="26"/>
+                <w:szCs w:val="40"/>
+              </w:rPr>
+              <w:t>–</w:t>
+            </w:r>
+            <w:r>
+              <w:rPr>
+                <w:rFonts w:ascii="BRH Malayalam Extra" w:hAnsi="BRH Malayalam Extra" w:cs="BRH Malayalam Extra"/>
+                <w:sz w:val="32"/>
+                <w:szCs w:val="40"/>
+              </w:rPr>
+              <w:t xml:space="preserve">J | </w:t>
             </w:r>
           </w:p>
           <w:p>
@@ -592,136 +541,79 @@
               <w:autoSpaceDE w:val="0"/>
               <w:autoSpaceDN w:val="0"/>
               <w:adjustRightInd w:val="0"/>
-              <w:spacing w:line="240" w:lineRule="auto"/>
-              <w:rPr>
-                <w:rFonts w:ascii="BRH Malayalam Extra" w:hAnsi="BRH Malayalam Extra" w:cs="BRH Malayalam Extra"/>
+              <w:spacing w:before="0" w:line="240" w:lineRule="auto"/>
+              <w:rPr>
+                <w:rFonts w:cs="BRH Malayalam Extra"/>
                 <w:color w:val="000000"/>
-                <w:sz w:val="32"/>
                 <w:szCs w:val="40"/>
               </w:rPr>
             </w:pPr>
             <w:r>
               <w:rPr>
                 <w:rFonts w:ascii="BRH Malayalam Extra" w:hAnsi="BRH Malayalam Extra" w:cs="BRH Malayalam Extra"/>
+                <w:sz w:val="32"/>
+                <w:szCs w:val="40"/>
+              </w:rPr>
+              <w:t>s</w:t>
+            </w:r>
+            <w:r>
+              <w:rPr>
+                <w:rFonts w:ascii="BRH Malayalam Extra" w:hAnsi="BRH Malayalam Extra" w:cs="BRH Malayalam Extra"/>
                 <w:color w:val="000000"/>
                 <w:sz w:val="32"/>
                 <w:szCs w:val="40"/>
-              </w:rPr>
-              <w:t>A</w:t>
+                <w:highlight w:val="green"/>
+              </w:rPr>
+              <w:t>¢</w:t>
+            </w:r>
+            <w:r>
+              <w:rPr>
+                <w:rFonts w:ascii="BRH Malayalam Extra" w:hAnsi="BRH Malayalam Extra" w:cs="BRH Malayalam Extra"/>
+                <w:sz w:val="32"/>
+                <w:szCs w:val="40"/>
+              </w:rPr>
+              <w:t xml:space="preserve"> ¥dx— d</w:t>
+            </w:r>
+            <w:r>
+              <w:rPr>
+                <w:rFonts w:ascii="BRH Malayalam Extra" w:hAnsi="BRH Malayalam Extra" w:cs="BRH Malayalam Extra"/>
+                <w:sz w:val="26"/>
+                <w:szCs w:val="40"/>
+              </w:rPr>
+              <w:t>–</w:t>
+            </w:r>
+            <w:r>
+              <w:rPr>
+                <w:rFonts w:ascii="BRH Malayalam Extra" w:hAnsi="BRH Malayalam Extra" w:cs="BRH Malayalam Extra"/>
+                <w:sz w:val="32"/>
+                <w:szCs w:val="40"/>
+              </w:rPr>
+              <w:t>J s¡ s</w:t>
             </w:r>
             <w:r>
               <w:rPr>
                 <w:rFonts w:ascii="BRH Malayalam Extra" w:hAnsi="BRH Malayalam Extra" w:cs="BRH Malayalam Extra"/>
                 <w:color w:val="000000"/>
-                <w:sz w:val="26"/>
-                <w:szCs w:val="40"/>
-              </w:rPr>
-              <w:t>–</w:t>
-            </w:r>
-            <w:r>
-              <w:rPr>
-                <w:rFonts w:ascii="BRH Malayalam Extra" w:hAnsi="BRH Malayalam Extra" w:cs="BRH Malayalam Extra"/>
-                <w:color w:val="000000"/>
-                <w:sz w:val="32"/>
-                <w:szCs w:val="40"/>
-              </w:rPr>
-              <w:t>¥sô pyqûx</w:t>
-            </w:r>
-            <w:r>
-              <w:rPr>
-                <w:rFonts w:ascii="BRH Malayalam Extra" w:hAnsi="BRH Malayalam Extra" w:cs="BRH Malayalam Extra"/>
-                <w:color w:val="000000"/>
-                <w:sz w:val="26"/>
-                <w:szCs w:val="40"/>
-              </w:rPr>
-              <w:t>–</w:t>
-            </w:r>
-            <w:r>
-              <w:rPr>
-                <w:rFonts w:ascii="BRH Malayalam Extra" w:hAnsi="BRH Malayalam Extra" w:cs="BRH Malayalam Extra"/>
-                <w:color w:val="000000"/>
-                <w:sz w:val="32"/>
-                <w:szCs w:val="40"/>
-              </w:rPr>
-              <w:t xml:space="preserve"> py</w:t>
-            </w:r>
-            <w:r>
-              <w:rPr>
-                <w:rFonts w:ascii="BRH Malayalam Extra" w:hAnsi="BRH Malayalam Extra" w:cs="BRH Malayalam Extra"/>
-                <w:color w:val="000000"/>
                 <w:sz w:val="32"/>
                 <w:szCs w:val="40"/>
                 <w:highlight w:val="green"/>
               </w:rPr>
-              <w:t>qûx</w:t>
-            </w:r>
-            <w:r>
-              <w:rPr>
-                <w:rFonts w:ascii="BRH Malayalam Extra" w:hAnsi="BRH Malayalam Extra" w:cs="BRH Malayalam Extra"/>
-                <w:color w:val="000000"/>
-                <w:sz w:val="26"/>
-                <w:szCs w:val="40"/>
-                <w:highlight w:val="green"/>
-              </w:rPr>
-              <w:t>–</w:t>
-            </w:r>
-            <w:r>
-              <w:rPr>
-                <w:rFonts w:ascii="BRH Malayalam Extra" w:hAnsi="BRH Malayalam Extra" w:cs="BRH Malayalam Extra"/>
-                <w:color w:val="000000"/>
-                <w:sz w:val="36"/>
-                <w:szCs w:val="36"/>
-                <w:highlight w:val="green"/>
-              </w:rPr>
-              <w:t>„</w:t>
-            </w:r>
-            <w:r>
-              <w:rPr>
-                <w:rFonts w:ascii="BRH Malayalam Extra" w:hAnsi="BRH Malayalam Extra" w:cs="BRH Malayalam Extra"/>
-                <w:color w:val="000000"/>
-                <w:sz w:val="32"/>
-                <w:szCs w:val="40"/>
-              </w:rPr>
-              <w:t>¥sô A</w:t>
-            </w:r>
-            <w:r>
-              <w:rPr>
-                <w:rFonts w:ascii="BRH Malayalam Extra" w:hAnsi="BRH Malayalam Extra" w:cs="BRH Malayalam Extra"/>
-                <w:color w:val="000000"/>
-                <w:sz w:val="26"/>
-                <w:szCs w:val="40"/>
-              </w:rPr>
-              <w:t>–</w:t>
-            </w:r>
-            <w:r>
-              <w:rPr>
-                <w:rFonts w:ascii="BRH Malayalam Extra" w:hAnsi="BRH Malayalam Extra" w:cs="BRH Malayalam Extra"/>
-                <w:color w:val="000000"/>
-                <w:sz w:val="32"/>
-                <w:szCs w:val="40"/>
-              </w:rPr>
-              <w:t xml:space="preserve">¥sô pyqûx˜ | </w:t>
-            </w:r>
-          </w:p>
-          <w:p>
-            <w:pPr>
-              <w:widowControl w:val="0"/>
-              <w:autoSpaceDE w:val="0"/>
-              <w:autoSpaceDN w:val="0"/>
-              <w:adjustRightInd w:val="0"/>
-              <w:spacing w:line="240" w:lineRule="auto"/>
-              <w:rPr>
-                <w:rFonts w:cs="BRH Malayalam Extra"/>
-                <w:color w:val="000000"/>
-                <w:szCs w:val="40"/>
-              </w:rPr>
-            </w:pPr>
+              <w:t>¢</w:t>
+            </w:r>
+            <w:r>
+              <w:rPr>
+                <w:rFonts w:ascii="BRH Malayalam Extra" w:hAnsi="BRH Malayalam Extra" w:cs="BRH Malayalam Extra"/>
+                <w:sz w:val="32"/>
+                <w:szCs w:val="40"/>
+              </w:rPr>
+              <w:t xml:space="preserve"> d—J |</w:t>
+            </w:r>
           </w:p>
         </w:tc>
       </w:tr>
       <w:tr>
         <w:trPr>
-          <w:trHeight w:val="1338"/>
+          <w:trHeight w:val="1098"/>
         </w:trPr>
         <w:tc>
           <w:tcPr>
@@ -733,7 +625,7 @@
               <w:autoSpaceDE w:val="0"/>
               <w:autoSpaceDN w:val="0"/>
               <w:adjustRightInd w:val="0"/>
-              <w:spacing w:line="240" w:lineRule="auto"/>
+              <w:spacing w:before="0" w:line="240" w:lineRule="auto"/>
               <w:rPr>
                 <w:rFonts w:ascii="BRH Malayalam Extra" w:hAnsi="BRH Malayalam Extra" w:cs="BRH Malayalam Extra"/>
                 <w:color w:val="000000"/>
@@ -747,7 +639,7 @@
                 <w:color w:val="000000"/>
                 <w:szCs w:val="40"/>
               </w:rPr>
-              <w:t>81</w:t>
+              <w:t>32</w:t>
             </w:r>
             <w:r>
               <w:rPr>
@@ -841,7 +733,7 @@
                 <w:color w:val="000000"/>
                 <w:szCs w:val="40"/>
               </w:rPr>
-              <w:t>75</w:t>
+              <w:t>29</w:t>
             </w:r>
             <w:r>
               <w:rPr>
@@ -850,25 +742,36 @@
                 <w:sz w:val="32"/>
                 <w:szCs w:val="40"/>
               </w:rPr>
-              <w:t>)-  D</w:t>
-            </w:r>
+              <w:t>)</w:t>
+            </w:r>
+            <w:proofErr w:type="gramStart"/>
             <w:r>
               <w:rPr>
                 <w:rFonts w:ascii="BRH Malayalam Extra" w:hAnsi="BRH Malayalam Extra" w:cs="BRH Malayalam Extra"/>
                 <w:color w:val="000000"/>
-                <w:sz w:val="26"/>
-                <w:szCs w:val="40"/>
-              </w:rPr>
-              <w:t>–</w:t>
-            </w:r>
+                <w:sz w:val="32"/>
+                <w:szCs w:val="40"/>
+              </w:rPr>
+              <w:t>-  A</w:t>
+            </w:r>
+            <w:proofErr w:type="gramEnd"/>
             <w:r>
               <w:rPr>
                 <w:rFonts w:ascii="BRH Malayalam Extra" w:hAnsi="BRH Malayalam Extra" w:cs="BRH Malayalam Extra"/>
                 <w:color w:val="000000"/>
-                <w:sz w:val="32"/>
-                <w:szCs w:val="40"/>
-              </w:rPr>
-              <w:t>ösyjx—s¡ ||</w:t>
+                <w:sz w:val="26"/>
+                <w:szCs w:val="40"/>
+              </w:rPr>
+              <w:t>–</w:t>
+            </w:r>
+            <w:r>
+              <w:rPr>
+                <w:rFonts w:ascii="BRH Malayalam Extra" w:hAnsi="BRH Malayalam Extra" w:cs="BRH Malayalam Extra"/>
+                <w:color w:val="000000"/>
+                <w:sz w:val="32"/>
+                <w:szCs w:val="40"/>
+              </w:rPr>
+              <w:t>¥sô | pyqûx˜ |</w:t>
             </w:r>
           </w:p>
           <w:p>
@@ -880,6 +783,7 @@
               <w:spacing w:before="0" w:line="240" w:lineRule="auto"/>
               <w:rPr>
                 <w:rFonts w:cs="BRH Malayalam Extra"/>
+                <w:color w:val="000000"/>
                 <w:szCs w:val="40"/>
               </w:rPr>
             </w:pPr>
@@ -890,7 +794,7 @@
                 <w:sz w:val="32"/>
                 <w:szCs w:val="40"/>
               </w:rPr>
-              <w:t>D</w:t>
+              <w:t>A</w:t>
             </w:r>
             <w:r>
               <w:rPr>
@@ -908,17 +812,35 @@
                 <w:sz w:val="32"/>
                 <w:szCs w:val="40"/>
               </w:rPr>
-              <w:t>ö</w:t>
+              <w:t>¥sô pyqûx</w:t>
             </w:r>
             <w:r>
               <w:rPr>
                 <w:rFonts w:ascii="BRH Malayalam Extra" w:hAnsi="BRH Malayalam Extra" w:cs="BRH Malayalam Extra"/>
                 <w:color w:val="000000"/>
+                <w:sz w:val="26"/>
+                <w:szCs w:val="40"/>
+              </w:rPr>
+              <w:t>–</w:t>
+            </w:r>
+            <w:r>
+              <w:rPr>
+                <w:rFonts w:ascii="BRH Malayalam Extra" w:hAnsi="BRH Malayalam Extra" w:cs="BRH Malayalam Extra"/>
+                <w:color w:val="000000"/>
+                <w:sz w:val="32"/>
+                <w:szCs w:val="40"/>
+              </w:rPr>
+              <w:t xml:space="preserve"> py</w:t>
+            </w:r>
+            <w:r>
+              <w:rPr>
+                <w:rFonts w:ascii="BRH Malayalam Extra" w:hAnsi="BRH Malayalam Extra" w:cs="BRH Malayalam Extra"/>
+                <w:color w:val="000000"/>
                 <w:sz w:val="32"/>
                 <w:szCs w:val="40"/>
                 <w:highlight w:val="yellow"/>
               </w:rPr>
-              <w:t>s</w:t>
+              <w:t>qûx</w:t>
             </w:r>
             <w:r>
               <w:rPr>
@@ -927,61 +849,53 @@
                 <w:sz w:val="32"/>
                 <w:szCs w:val="40"/>
               </w:rPr>
-              <w:t>y</w:t>
+              <w:t xml:space="preserve">— </w:t>
             </w:r>
             <w:r>
               <w:rPr>
                 <w:rFonts w:ascii="BRH Malayalam Extra" w:hAnsi="BRH Malayalam Extra" w:cs="BRH Malayalam Extra"/>
                 <w:color w:val="000000"/>
-                <w:sz w:val="26"/>
-                <w:szCs w:val="40"/>
-              </w:rPr>
-              <w:t>–</w:t>
+                <w:sz w:val="32"/>
+                <w:szCs w:val="40"/>
+                <w:highlight w:val="yellow"/>
+              </w:rPr>
+              <w:t>A</w:t>
             </w:r>
             <w:r>
               <w:rPr>
                 <w:rFonts w:ascii="BRH Malayalam Extra" w:hAnsi="BRH Malayalam Extra" w:cs="BRH Malayalam Extra"/>
                 <w:color w:val="000000"/>
-                <w:sz w:val="32"/>
-                <w:szCs w:val="40"/>
-              </w:rPr>
-              <w:t>jx</w:t>
+                <w:sz w:val="26"/>
+                <w:szCs w:val="40"/>
+              </w:rPr>
+              <w:t>–</w:t>
             </w:r>
             <w:r>
               <w:rPr>
                 <w:rFonts w:ascii="BRH Malayalam Extra" w:hAnsi="BRH Malayalam Extra" w:cs="BRH Malayalam Extra"/>
                 <w:color w:val="000000"/>
-                <w:sz w:val="26"/>
-                <w:szCs w:val="40"/>
-              </w:rPr>
-              <w:t>–</w:t>
+                <w:sz w:val="32"/>
+                <w:szCs w:val="40"/>
+              </w:rPr>
+              <w:t>¥sô A</w:t>
             </w:r>
             <w:r>
               <w:rPr>
                 <w:rFonts w:ascii="BRH Malayalam Extra" w:hAnsi="BRH Malayalam Extra" w:cs="BRH Malayalam Extra"/>
                 <w:color w:val="000000"/>
-                <w:sz w:val="32"/>
-                <w:szCs w:val="40"/>
-              </w:rPr>
-              <w:t>sûyZõ¡</w:t>
+                <w:sz w:val="26"/>
+                <w:szCs w:val="40"/>
+              </w:rPr>
+              <w:t>–</w:t>
             </w:r>
             <w:r>
               <w:rPr>
                 <w:rFonts w:ascii="BRH Malayalam Extra" w:hAnsi="BRH Malayalam Extra" w:cs="BRH Malayalam Extra"/>
                 <w:color w:val="000000"/>
-                <w:sz w:val="26"/>
-                <w:szCs w:val="40"/>
-              </w:rPr>
-              <w:t>–</w:t>
-            </w:r>
-            <w:r>
-              <w:rPr>
-                <w:rFonts w:ascii="BRH Malayalam Extra" w:hAnsi="BRH Malayalam Extra" w:cs="BRH Malayalam Extra"/>
-                <w:color w:val="000000"/>
-                <w:sz w:val="32"/>
-                <w:szCs w:val="40"/>
-              </w:rPr>
-              <w:t>ösyjx—s¡ |</w:t>
+                <w:sz w:val="32"/>
+                <w:szCs w:val="40"/>
+              </w:rPr>
+              <w:t xml:space="preserve">¥sô pyqûx˜ | </w:t>
             </w:r>
           </w:p>
         </w:tc>
@@ -995,7 +909,7 @@
               <w:autoSpaceDE w:val="0"/>
               <w:autoSpaceDN w:val="0"/>
               <w:adjustRightInd w:val="0"/>
-              <w:spacing w:line="240" w:lineRule="auto"/>
+              <w:spacing w:before="0" w:line="240" w:lineRule="auto"/>
               <w:rPr>
                 <w:rFonts w:ascii="BRH Malayalam Extra" w:hAnsi="BRH Malayalam Extra" w:cs="BRH Malayalam Extra"/>
                 <w:color w:val="000000"/>
@@ -1009,7 +923,7 @@
                 <w:color w:val="000000"/>
                 <w:szCs w:val="40"/>
               </w:rPr>
-              <w:t>81</w:t>
+              <w:t>32</w:t>
             </w:r>
             <w:r>
               <w:rPr>
@@ -1103,7 +1017,7 @@
                 <w:color w:val="000000"/>
                 <w:szCs w:val="40"/>
               </w:rPr>
-              <w:t>75</w:t>
+              <w:t>29</w:t>
             </w:r>
             <w:r>
               <w:rPr>
@@ -1112,113 +1026,36 @@
                 <w:sz w:val="32"/>
                 <w:szCs w:val="40"/>
               </w:rPr>
-              <w:t>)-  D</w:t>
-            </w:r>
+              <w:t>)</w:t>
+            </w:r>
+            <w:proofErr w:type="gramStart"/>
             <w:r>
               <w:rPr>
                 <w:rFonts w:ascii="BRH Malayalam Extra" w:hAnsi="BRH Malayalam Extra" w:cs="BRH Malayalam Extra"/>
                 <w:color w:val="000000"/>
-                <w:sz w:val="26"/>
-                <w:szCs w:val="40"/>
-              </w:rPr>
-              <w:t>–</w:t>
-            </w:r>
+                <w:sz w:val="32"/>
+                <w:szCs w:val="40"/>
+              </w:rPr>
+              <w:t>-  A</w:t>
+            </w:r>
+            <w:proofErr w:type="gramEnd"/>
             <w:r>
               <w:rPr>
                 <w:rFonts w:ascii="BRH Malayalam Extra" w:hAnsi="BRH Malayalam Extra" w:cs="BRH Malayalam Extra"/>
                 <w:color w:val="000000"/>
-                <w:sz w:val="32"/>
-                <w:szCs w:val="40"/>
-              </w:rPr>
-              <w:t>ösyjx—s¡ ||</w:t>
-            </w:r>
-          </w:p>
-          <w:p>
-            <w:pPr>
-              <w:widowControl w:val="0"/>
-              <w:autoSpaceDE w:val="0"/>
-              <w:autoSpaceDN w:val="0"/>
-              <w:adjustRightInd w:val="0"/>
-              <w:spacing w:line="240" w:lineRule="auto"/>
+                <w:sz w:val="26"/>
+                <w:szCs w:val="40"/>
+              </w:rPr>
+              <w:t>–</w:t>
+            </w:r>
+            <w:r>
               <w:rPr>
                 <w:rFonts w:ascii="BRH Malayalam Extra" w:hAnsi="BRH Malayalam Extra" w:cs="BRH Malayalam Extra"/>
                 <w:color w:val="000000"/>
                 <w:sz w:val="32"/>
                 <w:szCs w:val="40"/>
               </w:rPr>
-            </w:pPr>
-            <w:r>
-              <w:rPr>
-                <w:rFonts w:ascii="BRH Malayalam Extra" w:hAnsi="BRH Malayalam Extra" w:cs="BRH Malayalam Extra"/>
-                <w:color w:val="000000"/>
-                <w:sz w:val="32"/>
-                <w:szCs w:val="40"/>
-              </w:rPr>
-              <w:t>D</w:t>
-            </w:r>
-            <w:r>
-              <w:rPr>
-                <w:rFonts w:ascii="BRH Malayalam Extra" w:hAnsi="BRH Malayalam Extra" w:cs="BRH Malayalam Extra"/>
-                <w:color w:val="000000"/>
-                <w:sz w:val="26"/>
-                <w:szCs w:val="40"/>
-              </w:rPr>
-              <w:t>–</w:t>
-            </w:r>
-            <w:r>
-              <w:rPr>
-                <w:rFonts w:ascii="BRH Malayalam Extra" w:hAnsi="BRH Malayalam Extra" w:cs="BRH Malayalam Extra"/>
-                <w:color w:val="000000"/>
-                <w:sz w:val="32"/>
-                <w:szCs w:val="40"/>
-                <w:highlight w:val="green"/>
-              </w:rPr>
-              <w:t>ösy</w:t>
-            </w:r>
-            <w:r>
-              <w:rPr>
-                <w:rFonts w:ascii="BRH Malayalam Extra" w:hAnsi="BRH Malayalam Extra" w:cs="BRH Malayalam Extra"/>
-                <w:color w:val="000000"/>
-                <w:sz w:val="32"/>
-                <w:szCs w:val="40"/>
-              </w:rPr>
-              <w:t>jx</w:t>
-            </w:r>
-            <w:r>
-              <w:rPr>
-                <w:rFonts w:ascii="BRH Malayalam Extra" w:hAnsi="BRH Malayalam Extra" w:cs="BRH Malayalam Extra"/>
-                <w:color w:val="000000"/>
-                <w:sz w:val="26"/>
-                <w:szCs w:val="40"/>
-              </w:rPr>
-              <w:t>–</w:t>
-            </w:r>
-            <w:r>
-              <w:rPr>
-                <w:rFonts w:ascii="BRH Malayalam Extra" w:hAnsi="BRH Malayalam Extra" w:cs="BRH Malayalam Extra"/>
-                <w:color w:val="000000"/>
-                <w:sz w:val="32"/>
-                <w:szCs w:val="40"/>
-              </w:rPr>
-              <w:t>sûyZõ¡</w:t>
-            </w:r>
-            <w:r>
-              <w:rPr>
-                <w:rFonts w:ascii="BRH Malayalam Extra" w:hAnsi="BRH Malayalam Extra" w:cs="BRH Malayalam Extra"/>
-                <w:color w:val="000000"/>
-                <w:sz w:val="26"/>
-                <w:szCs w:val="40"/>
-              </w:rPr>
-              <w:t>–</w:t>
-            </w:r>
-            <w:r>
-              <w:rPr>
-                <w:rFonts w:ascii="BRH Malayalam Extra" w:hAnsi="BRH Malayalam Extra" w:cs="BRH Malayalam Extra"/>
-                <w:color w:val="000000"/>
-                <w:sz w:val="32"/>
-                <w:szCs w:val="40"/>
-              </w:rPr>
-              <w:t xml:space="preserve">ösyjx—s¡ | </w:t>
+              <w:t>¥sô | pyqûx˜ |</w:t>
             </w:r>
           </w:p>
           <w:p>
@@ -1230,9 +1067,636 @@
               <w:spacing w:before="0" w:line="240" w:lineRule="auto"/>
               <w:rPr>
                 <w:rFonts w:cs="BRH Malayalam Extra"/>
+                <w:color w:val="000000"/>
                 <w:szCs w:val="40"/>
               </w:rPr>
             </w:pPr>
+            <w:r>
+              <w:rPr>
+                <w:rFonts w:ascii="BRH Malayalam Extra" w:hAnsi="BRH Malayalam Extra" w:cs="BRH Malayalam Extra"/>
+                <w:color w:val="000000"/>
+                <w:sz w:val="32"/>
+                <w:szCs w:val="40"/>
+              </w:rPr>
+              <w:t>A</w:t>
+            </w:r>
+            <w:r>
+              <w:rPr>
+                <w:rFonts w:ascii="BRH Malayalam Extra" w:hAnsi="BRH Malayalam Extra" w:cs="BRH Malayalam Extra"/>
+                <w:color w:val="000000"/>
+                <w:sz w:val="26"/>
+                <w:szCs w:val="40"/>
+              </w:rPr>
+              <w:t>–</w:t>
+            </w:r>
+            <w:r>
+              <w:rPr>
+                <w:rFonts w:ascii="BRH Malayalam Extra" w:hAnsi="BRH Malayalam Extra" w:cs="BRH Malayalam Extra"/>
+                <w:color w:val="000000"/>
+                <w:sz w:val="32"/>
+                <w:szCs w:val="40"/>
+              </w:rPr>
+              <w:t>¥sô pyqûx</w:t>
+            </w:r>
+            <w:r>
+              <w:rPr>
+                <w:rFonts w:ascii="BRH Malayalam Extra" w:hAnsi="BRH Malayalam Extra" w:cs="BRH Malayalam Extra"/>
+                <w:color w:val="000000"/>
+                <w:sz w:val="26"/>
+                <w:szCs w:val="40"/>
+              </w:rPr>
+              <w:t>–</w:t>
+            </w:r>
+            <w:r>
+              <w:rPr>
+                <w:rFonts w:ascii="BRH Malayalam Extra" w:hAnsi="BRH Malayalam Extra" w:cs="BRH Malayalam Extra"/>
+                <w:color w:val="000000"/>
+                <w:sz w:val="32"/>
+                <w:szCs w:val="40"/>
+              </w:rPr>
+              <w:t xml:space="preserve"> py</w:t>
+            </w:r>
+            <w:r>
+              <w:rPr>
+                <w:rFonts w:ascii="BRH Malayalam Extra" w:hAnsi="BRH Malayalam Extra" w:cs="BRH Malayalam Extra"/>
+                <w:color w:val="000000"/>
+                <w:sz w:val="32"/>
+                <w:szCs w:val="40"/>
+                <w:highlight w:val="green"/>
+              </w:rPr>
+              <w:t>qûx</w:t>
+            </w:r>
+            <w:r>
+              <w:rPr>
+                <w:rFonts w:ascii="BRH Malayalam Extra" w:hAnsi="BRH Malayalam Extra" w:cs="BRH Malayalam Extra"/>
+                <w:color w:val="000000"/>
+                <w:sz w:val="26"/>
+                <w:szCs w:val="40"/>
+                <w:highlight w:val="green"/>
+              </w:rPr>
+              <w:t>–</w:t>
+            </w:r>
+            <w:r>
+              <w:rPr>
+                <w:rFonts w:ascii="BRH Malayalam Extra" w:hAnsi="BRH Malayalam Extra" w:cs="BRH Malayalam Extra"/>
+                <w:color w:val="000000"/>
+                <w:sz w:val="36"/>
+                <w:szCs w:val="36"/>
+                <w:highlight w:val="green"/>
+              </w:rPr>
+              <w:t>„</w:t>
+            </w:r>
+            <w:r>
+              <w:rPr>
+                <w:rFonts w:ascii="BRH Malayalam Extra" w:hAnsi="BRH Malayalam Extra" w:cs="BRH Malayalam Extra"/>
+                <w:color w:val="000000"/>
+                <w:sz w:val="32"/>
+                <w:szCs w:val="40"/>
+              </w:rPr>
+              <w:t>¥sô A</w:t>
+            </w:r>
+            <w:r>
+              <w:rPr>
+                <w:rFonts w:ascii="BRH Malayalam Extra" w:hAnsi="BRH Malayalam Extra" w:cs="BRH Malayalam Extra"/>
+                <w:color w:val="000000"/>
+                <w:sz w:val="26"/>
+                <w:szCs w:val="40"/>
+              </w:rPr>
+              <w:t>–</w:t>
+            </w:r>
+            <w:r>
+              <w:rPr>
+                <w:rFonts w:ascii="BRH Malayalam Extra" w:hAnsi="BRH Malayalam Extra" w:cs="BRH Malayalam Extra"/>
+                <w:color w:val="000000"/>
+                <w:sz w:val="32"/>
+                <w:szCs w:val="40"/>
+              </w:rPr>
+              <w:t xml:space="preserve">¥sô pyqûx˜ | </w:t>
+            </w:r>
+          </w:p>
+        </w:tc>
+      </w:tr>
+      <w:tr>
+        <w:trPr>
+          <w:trHeight w:val="1072"/>
+        </w:trPr>
+        <w:tc>
+          <w:tcPr>
+            <w:tcW w:w="7379" w:type="dxa"/>
+          </w:tcPr>
+          <w:p>
+            <w:pPr>
+              <w:widowControl w:val="0"/>
+              <w:autoSpaceDE w:val="0"/>
+              <w:autoSpaceDN w:val="0"/>
+              <w:adjustRightInd w:val="0"/>
+              <w:spacing w:before="0" w:line="240" w:lineRule="auto"/>
+              <w:rPr>
+                <w:rFonts w:ascii="BRH Malayalam Extra" w:hAnsi="BRH Malayalam Extra" w:cs="BRH Malayalam Extra"/>
+                <w:color w:val="000000"/>
+                <w:sz w:val="32"/>
+                <w:szCs w:val="40"/>
+              </w:rPr>
+            </w:pPr>
+            <w:r>
+              <w:rPr>
+                <w:rFonts w:cs="BRH Malayalam Extra"/>
+                <w:color w:val="000000"/>
+                <w:szCs w:val="40"/>
+              </w:rPr>
+              <w:t>81</w:t>
+            </w:r>
+            <w:r>
+              <w:rPr>
+                <w:rFonts w:ascii="BRH Malayalam Extra" w:hAnsi="BRH Malayalam Extra" w:cs="BRH Malayalam Extra"/>
+                <w:color w:val="000000"/>
+                <w:sz w:val="32"/>
+                <w:szCs w:val="40"/>
+              </w:rPr>
+              <w:t>)</w:t>
+            </w:r>
+            <w:r>
+              <w:rPr>
+                <w:rFonts w:ascii="BRH Malayalam Extra" w:hAnsi="BRH Malayalam Extra" w:cs="BRH Malayalam Extra"/>
+                <w:color w:val="000000"/>
+                <w:sz w:val="32"/>
+                <w:szCs w:val="40"/>
+              </w:rPr>
+              <w:tab/>
+            </w:r>
+            <w:r>
+              <w:rPr>
+                <w:rFonts w:cs="BRH Malayalam Extra"/>
+                <w:color w:val="000000"/>
+                <w:szCs w:val="40"/>
+              </w:rPr>
+              <w:t>1</w:t>
+            </w:r>
+            <w:r>
+              <w:rPr>
+                <w:rFonts w:ascii="BRH Malayalam Extra" w:hAnsi="BRH Malayalam Extra" w:cs="BRH Malayalam Extra"/>
+                <w:color w:val="000000"/>
+                <w:sz w:val="32"/>
+                <w:szCs w:val="40"/>
+              </w:rPr>
+              <w:t>.</w:t>
+            </w:r>
+            <w:r>
+              <w:rPr>
+                <w:rFonts w:cs="BRH Malayalam Extra"/>
+                <w:color w:val="000000"/>
+                <w:szCs w:val="40"/>
+              </w:rPr>
+              <w:t>8</w:t>
+            </w:r>
+            <w:r>
+              <w:rPr>
+                <w:rFonts w:ascii="BRH Malayalam Extra" w:hAnsi="BRH Malayalam Extra" w:cs="BRH Malayalam Extra"/>
+                <w:color w:val="000000"/>
+                <w:sz w:val="32"/>
+                <w:szCs w:val="40"/>
+              </w:rPr>
+              <w:t>.</w:t>
+            </w:r>
+            <w:r>
+              <w:rPr>
+                <w:rFonts w:cs="BRH Malayalam Extra"/>
+                <w:color w:val="000000"/>
+                <w:szCs w:val="40"/>
+              </w:rPr>
+              <w:t>22</w:t>
+            </w:r>
+            <w:r>
+              <w:rPr>
+                <w:rFonts w:ascii="BRH Malayalam Extra" w:hAnsi="BRH Malayalam Extra" w:cs="BRH Malayalam Extra"/>
+                <w:color w:val="000000"/>
+                <w:sz w:val="32"/>
+                <w:szCs w:val="40"/>
+              </w:rPr>
+              <w:t>.</w:t>
+            </w:r>
+            <w:r>
+              <w:rPr>
+                <w:rFonts w:cs="BRH Malayalam Extra"/>
+                <w:color w:val="000000"/>
+                <w:szCs w:val="40"/>
+              </w:rPr>
+              <w:t>5</w:t>
+            </w:r>
+            <w:r>
+              <w:rPr>
+                <w:rFonts w:ascii="BRH Malayalam Extra" w:hAnsi="BRH Malayalam Extra" w:cs="BRH Malayalam Extra"/>
+                <w:color w:val="000000"/>
+                <w:sz w:val="32"/>
+                <w:szCs w:val="40"/>
+              </w:rPr>
+              <w:t>(</w:t>
+            </w:r>
+            <w:r>
+              <w:rPr>
+                <w:rFonts w:cs="BRH Malayalam Extra"/>
+                <w:color w:val="000000"/>
+                <w:szCs w:val="40"/>
+              </w:rPr>
+              <w:t>75</w:t>
+            </w:r>
+            <w:r>
+              <w:rPr>
+                <w:rFonts w:ascii="BRH Malayalam Extra" w:hAnsi="BRH Malayalam Extra" w:cs="BRH Malayalam Extra"/>
+                <w:color w:val="000000"/>
+                <w:sz w:val="32"/>
+                <w:szCs w:val="40"/>
+              </w:rPr>
+              <w:t>)</w:t>
+            </w:r>
+            <w:proofErr w:type="gramStart"/>
+            <w:r>
+              <w:rPr>
+                <w:rFonts w:ascii="BRH Malayalam Extra" w:hAnsi="BRH Malayalam Extra" w:cs="BRH Malayalam Extra"/>
+                <w:color w:val="000000"/>
+                <w:sz w:val="32"/>
+                <w:szCs w:val="40"/>
+              </w:rPr>
+              <w:t>-  D</w:t>
+            </w:r>
+            <w:proofErr w:type="gramEnd"/>
+            <w:r>
+              <w:rPr>
+                <w:rFonts w:ascii="BRH Malayalam Extra" w:hAnsi="BRH Malayalam Extra" w:cs="BRH Malayalam Extra"/>
+                <w:color w:val="000000"/>
+                <w:sz w:val="26"/>
+                <w:szCs w:val="40"/>
+              </w:rPr>
+              <w:t>–</w:t>
+            </w:r>
+            <w:r>
+              <w:rPr>
+                <w:rFonts w:ascii="BRH Malayalam Extra" w:hAnsi="BRH Malayalam Extra" w:cs="BRH Malayalam Extra"/>
+                <w:color w:val="000000"/>
+                <w:sz w:val="32"/>
+                <w:szCs w:val="40"/>
+              </w:rPr>
+              <w:t>ösyjx—s¡ ||</w:t>
+            </w:r>
+          </w:p>
+          <w:p>
+            <w:pPr>
+              <w:widowControl w:val="0"/>
+              <w:autoSpaceDE w:val="0"/>
+              <w:autoSpaceDN w:val="0"/>
+              <w:adjustRightInd w:val="0"/>
+              <w:spacing w:before="0" w:line="240" w:lineRule="auto"/>
+              <w:rPr>
+                <w:rFonts w:cs="BRH Malayalam Extra"/>
+                <w:szCs w:val="40"/>
+              </w:rPr>
+            </w:pPr>
+            <w:r>
+              <w:rPr>
+                <w:rFonts w:ascii="BRH Malayalam Extra" w:hAnsi="BRH Malayalam Extra" w:cs="BRH Malayalam Extra"/>
+                <w:color w:val="000000"/>
+                <w:sz w:val="32"/>
+                <w:szCs w:val="40"/>
+              </w:rPr>
+              <w:t>D</w:t>
+            </w:r>
+            <w:r>
+              <w:rPr>
+                <w:rFonts w:ascii="BRH Malayalam Extra" w:hAnsi="BRH Malayalam Extra" w:cs="BRH Malayalam Extra"/>
+                <w:color w:val="000000"/>
+                <w:sz w:val="26"/>
+                <w:szCs w:val="40"/>
+              </w:rPr>
+              <w:t>–</w:t>
+            </w:r>
+            <w:r>
+              <w:rPr>
+                <w:rFonts w:ascii="BRH Malayalam Extra" w:hAnsi="BRH Malayalam Extra" w:cs="BRH Malayalam Extra"/>
+                <w:color w:val="000000"/>
+                <w:sz w:val="32"/>
+                <w:szCs w:val="40"/>
+              </w:rPr>
+              <w:t>ö</w:t>
+            </w:r>
+            <w:r>
+              <w:rPr>
+                <w:rFonts w:ascii="BRH Malayalam Extra" w:hAnsi="BRH Malayalam Extra" w:cs="BRH Malayalam Extra"/>
+                <w:color w:val="000000"/>
+                <w:sz w:val="32"/>
+                <w:szCs w:val="40"/>
+                <w:highlight w:val="yellow"/>
+              </w:rPr>
+              <w:t>s</w:t>
+            </w:r>
+            <w:r>
+              <w:rPr>
+                <w:rFonts w:ascii="BRH Malayalam Extra" w:hAnsi="BRH Malayalam Extra" w:cs="BRH Malayalam Extra"/>
+                <w:color w:val="000000"/>
+                <w:sz w:val="32"/>
+                <w:szCs w:val="40"/>
+              </w:rPr>
+              <w:t>y</w:t>
+            </w:r>
+            <w:r>
+              <w:rPr>
+                <w:rFonts w:ascii="BRH Malayalam Extra" w:hAnsi="BRH Malayalam Extra" w:cs="BRH Malayalam Extra"/>
+                <w:color w:val="000000"/>
+                <w:sz w:val="26"/>
+                <w:szCs w:val="40"/>
+              </w:rPr>
+              <w:t>–</w:t>
+            </w:r>
+            <w:r>
+              <w:rPr>
+                <w:rFonts w:ascii="BRH Malayalam Extra" w:hAnsi="BRH Malayalam Extra" w:cs="BRH Malayalam Extra"/>
+                <w:color w:val="000000"/>
+                <w:sz w:val="32"/>
+                <w:szCs w:val="40"/>
+              </w:rPr>
+              <w:t>jx</w:t>
+            </w:r>
+            <w:r>
+              <w:rPr>
+                <w:rFonts w:ascii="BRH Malayalam Extra" w:hAnsi="BRH Malayalam Extra" w:cs="BRH Malayalam Extra"/>
+                <w:color w:val="000000"/>
+                <w:sz w:val="26"/>
+                <w:szCs w:val="40"/>
+              </w:rPr>
+              <w:t>–</w:t>
+            </w:r>
+            <w:r>
+              <w:rPr>
+                <w:rFonts w:ascii="BRH Malayalam Extra" w:hAnsi="BRH Malayalam Extra" w:cs="BRH Malayalam Extra"/>
+                <w:color w:val="000000"/>
+                <w:sz w:val="32"/>
+                <w:szCs w:val="40"/>
+              </w:rPr>
+              <w:t>sûyZõ¡</w:t>
+            </w:r>
+            <w:r>
+              <w:rPr>
+                <w:rFonts w:ascii="BRH Malayalam Extra" w:hAnsi="BRH Malayalam Extra" w:cs="BRH Malayalam Extra"/>
+                <w:color w:val="000000"/>
+                <w:sz w:val="26"/>
+                <w:szCs w:val="40"/>
+              </w:rPr>
+              <w:t>–</w:t>
+            </w:r>
+            <w:r>
+              <w:rPr>
+                <w:rFonts w:ascii="BRH Malayalam Extra" w:hAnsi="BRH Malayalam Extra" w:cs="BRH Malayalam Extra"/>
+                <w:color w:val="000000"/>
+                <w:sz w:val="32"/>
+                <w:szCs w:val="40"/>
+              </w:rPr>
+              <w:t>ösyjx—s¡ |</w:t>
+            </w:r>
+          </w:p>
+        </w:tc>
+        <w:tc>
+          <w:tcPr>
+            <w:tcW w:w="7300" w:type="dxa"/>
+          </w:tcPr>
+          <w:p>
+            <w:pPr>
+              <w:widowControl w:val="0"/>
+              <w:autoSpaceDE w:val="0"/>
+              <w:autoSpaceDN w:val="0"/>
+              <w:adjustRightInd w:val="0"/>
+              <w:spacing w:before="0" w:line="240" w:lineRule="auto"/>
+              <w:rPr>
+                <w:rFonts w:ascii="BRH Malayalam Extra" w:hAnsi="BRH Malayalam Extra" w:cs="BRH Malayalam Extra"/>
+                <w:color w:val="000000"/>
+                <w:sz w:val="32"/>
+                <w:szCs w:val="40"/>
+              </w:rPr>
+            </w:pPr>
+            <w:r>
+              <w:rPr>
+                <w:rFonts w:cs="BRH Malayalam Extra"/>
+                <w:color w:val="000000"/>
+                <w:szCs w:val="40"/>
+              </w:rPr>
+              <w:t>81</w:t>
+            </w:r>
+            <w:r>
+              <w:rPr>
+                <w:rFonts w:ascii="BRH Malayalam Extra" w:hAnsi="BRH Malayalam Extra" w:cs="BRH Malayalam Extra"/>
+                <w:color w:val="000000"/>
+                <w:sz w:val="32"/>
+                <w:szCs w:val="40"/>
+              </w:rPr>
+              <w:t>)</w:t>
+            </w:r>
+            <w:r>
+              <w:rPr>
+                <w:rFonts w:ascii="BRH Malayalam Extra" w:hAnsi="BRH Malayalam Extra" w:cs="BRH Malayalam Extra"/>
+                <w:color w:val="000000"/>
+                <w:sz w:val="32"/>
+                <w:szCs w:val="40"/>
+              </w:rPr>
+              <w:tab/>
+            </w:r>
+            <w:r>
+              <w:rPr>
+                <w:rFonts w:cs="BRH Malayalam Extra"/>
+                <w:color w:val="000000"/>
+                <w:szCs w:val="40"/>
+              </w:rPr>
+              <w:t>1</w:t>
+            </w:r>
+            <w:r>
+              <w:rPr>
+                <w:rFonts w:ascii="BRH Malayalam Extra" w:hAnsi="BRH Malayalam Extra" w:cs="BRH Malayalam Extra"/>
+                <w:color w:val="000000"/>
+                <w:sz w:val="32"/>
+                <w:szCs w:val="40"/>
+              </w:rPr>
+              <w:t>.</w:t>
+            </w:r>
+            <w:r>
+              <w:rPr>
+                <w:rFonts w:cs="BRH Malayalam Extra"/>
+                <w:color w:val="000000"/>
+                <w:szCs w:val="40"/>
+              </w:rPr>
+              <w:t>8</w:t>
+            </w:r>
+            <w:r>
+              <w:rPr>
+                <w:rFonts w:ascii="BRH Malayalam Extra" w:hAnsi="BRH Malayalam Extra" w:cs="BRH Malayalam Extra"/>
+                <w:color w:val="000000"/>
+                <w:sz w:val="32"/>
+                <w:szCs w:val="40"/>
+              </w:rPr>
+              <w:t>.</w:t>
+            </w:r>
+            <w:r>
+              <w:rPr>
+                <w:rFonts w:cs="BRH Malayalam Extra"/>
+                <w:color w:val="000000"/>
+                <w:szCs w:val="40"/>
+              </w:rPr>
+              <w:t>22</w:t>
+            </w:r>
+            <w:r>
+              <w:rPr>
+                <w:rFonts w:ascii="BRH Malayalam Extra" w:hAnsi="BRH Malayalam Extra" w:cs="BRH Malayalam Extra"/>
+                <w:color w:val="000000"/>
+                <w:sz w:val="32"/>
+                <w:szCs w:val="40"/>
+              </w:rPr>
+              <w:t>.</w:t>
+            </w:r>
+            <w:r>
+              <w:rPr>
+                <w:rFonts w:cs="BRH Malayalam Extra"/>
+                <w:color w:val="000000"/>
+                <w:szCs w:val="40"/>
+              </w:rPr>
+              <w:t>5</w:t>
+            </w:r>
+            <w:r>
+              <w:rPr>
+                <w:rFonts w:ascii="BRH Malayalam Extra" w:hAnsi="BRH Malayalam Extra" w:cs="BRH Malayalam Extra"/>
+                <w:color w:val="000000"/>
+                <w:sz w:val="32"/>
+                <w:szCs w:val="40"/>
+              </w:rPr>
+              <w:t>(</w:t>
+            </w:r>
+            <w:r>
+              <w:rPr>
+                <w:rFonts w:cs="BRH Malayalam Extra"/>
+                <w:color w:val="000000"/>
+                <w:szCs w:val="40"/>
+              </w:rPr>
+              <w:t>75</w:t>
+            </w:r>
+            <w:r>
+              <w:rPr>
+                <w:rFonts w:ascii="BRH Malayalam Extra" w:hAnsi="BRH Malayalam Extra" w:cs="BRH Malayalam Extra"/>
+                <w:color w:val="000000"/>
+                <w:sz w:val="32"/>
+                <w:szCs w:val="40"/>
+              </w:rPr>
+              <w:t>)</w:t>
+            </w:r>
+            <w:proofErr w:type="gramStart"/>
+            <w:r>
+              <w:rPr>
+                <w:rFonts w:ascii="BRH Malayalam Extra" w:hAnsi="BRH Malayalam Extra" w:cs="BRH Malayalam Extra"/>
+                <w:color w:val="000000"/>
+                <w:sz w:val="32"/>
+                <w:szCs w:val="40"/>
+              </w:rPr>
+              <w:t>-  D</w:t>
+            </w:r>
+            <w:proofErr w:type="gramEnd"/>
+            <w:r>
+              <w:rPr>
+                <w:rFonts w:ascii="BRH Malayalam Extra" w:hAnsi="BRH Malayalam Extra" w:cs="BRH Malayalam Extra"/>
+                <w:color w:val="000000"/>
+                <w:sz w:val="26"/>
+                <w:szCs w:val="40"/>
+              </w:rPr>
+              <w:t>–</w:t>
+            </w:r>
+            <w:r>
+              <w:rPr>
+                <w:rFonts w:ascii="BRH Malayalam Extra" w:hAnsi="BRH Malayalam Extra" w:cs="BRH Malayalam Extra"/>
+                <w:color w:val="000000"/>
+                <w:sz w:val="32"/>
+                <w:szCs w:val="40"/>
+              </w:rPr>
+              <w:t>ösyjx—s¡ ||</w:t>
+            </w:r>
+          </w:p>
+          <w:p>
+            <w:pPr>
+              <w:widowControl w:val="0"/>
+              <w:autoSpaceDE w:val="0"/>
+              <w:autoSpaceDN w:val="0"/>
+              <w:adjustRightInd w:val="0"/>
+              <w:spacing w:before="0" w:line="240" w:lineRule="auto"/>
+              <w:rPr>
+                <w:rFonts w:cs="BRH Malayalam Extra"/>
+                <w:szCs w:val="40"/>
+              </w:rPr>
+            </w:pPr>
+            <w:r>
+              <w:rPr>
+                <w:rFonts w:ascii="BRH Malayalam Extra" w:hAnsi="BRH Malayalam Extra" w:cs="BRH Malayalam Extra"/>
+                <w:color w:val="000000"/>
+                <w:sz w:val="32"/>
+                <w:szCs w:val="40"/>
+              </w:rPr>
+              <w:t>D</w:t>
+            </w:r>
+            <w:r>
+              <w:rPr>
+                <w:rFonts w:ascii="BRH Malayalam Extra" w:hAnsi="BRH Malayalam Extra" w:cs="BRH Malayalam Extra"/>
+                <w:color w:val="000000"/>
+                <w:sz w:val="26"/>
+                <w:szCs w:val="40"/>
+              </w:rPr>
+              <w:t>–</w:t>
+            </w:r>
+            <w:r>
+              <w:rPr>
+                <w:rFonts w:ascii="BRH Malayalam Extra" w:hAnsi="BRH Malayalam Extra" w:cs="BRH Malayalam Extra"/>
+                <w:color w:val="000000"/>
+                <w:sz w:val="32"/>
+                <w:szCs w:val="40"/>
+                <w:highlight w:val="green"/>
+              </w:rPr>
+              <w:t>ösy</w:t>
+            </w:r>
+            <w:r>
+              <w:rPr>
+                <w:rFonts w:ascii="BRH Malayalam Extra" w:hAnsi="BRH Malayalam Extra" w:cs="BRH Malayalam Extra"/>
+                <w:color w:val="000000"/>
+                <w:sz w:val="32"/>
+                <w:szCs w:val="40"/>
+              </w:rPr>
+              <w:t>jx</w:t>
+            </w:r>
+            <w:r>
+              <w:rPr>
+                <w:rFonts w:ascii="BRH Malayalam Extra" w:hAnsi="BRH Malayalam Extra" w:cs="BRH Malayalam Extra"/>
+                <w:color w:val="000000"/>
+                <w:sz w:val="26"/>
+                <w:szCs w:val="40"/>
+              </w:rPr>
+              <w:t>–</w:t>
+            </w:r>
+            <w:r>
+              <w:rPr>
+                <w:rFonts w:ascii="BRH Malayalam Extra" w:hAnsi="BRH Malayalam Extra" w:cs="BRH Malayalam Extra"/>
+                <w:color w:val="000000"/>
+                <w:sz w:val="32"/>
+                <w:szCs w:val="40"/>
+              </w:rPr>
+              <w:t>sûyZõ¡</w:t>
+            </w:r>
+            <w:r>
+              <w:rPr>
+                <w:rFonts w:ascii="BRH Malayalam Extra" w:hAnsi="BRH Malayalam Extra" w:cs="BRH Malayalam Extra"/>
+                <w:color w:val="000000"/>
+                <w:sz w:val="26"/>
+                <w:szCs w:val="40"/>
+              </w:rPr>
+              <w:t>–</w:t>
+            </w:r>
+            <w:r>
+              <w:rPr>
+                <w:rFonts w:ascii="BRH Malayalam Extra" w:hAnsi="BRH Malayalam Extra" w:cs="BRH Malayalam Extra"/>
+                <w:color w:val="000000"/>
+                <w:sz w:val="32"/>
+                <w:szCs w:val="40"/>
+              </w:rPr>
+              <w:t xml:space="preserve">ösyjx—s¡ | </w:t>
+            </w:r>
           </w:p>
         </w:tc>
       </w:tr>
@@ -3258,8 +3722,18 @@
                 <w:sz w:val="32"/>
                 <w:szCs w:val="40"/>
               </w:rPr>
-              <w:t>)-  öe</w:t>
-            </w:r>
+              <w:t>)</w:t>
+            </w:r>
+            <w:proofErr w:type="gramStart"/>
+            <w:r>
+              <w:rPr>
+                <w:rFonts w:ascii="BRH Malayalam Extra" w:hAnsi="BRH Malayalam Extra" w:cs="BRH Malayalam Extra"/>
+                <w:sz w:val="32"/>
+                <w:szCs w:val="40"/>
+              </w:rPr>
+              <w:t>-  öe</w:t>
+            </w:r>
+            <w:proofErr w:type="gramEnd"/>
             <w:r>
               <w:rPr>
                 <w:rFonts w:ascii="BRH Malayalam Extra" w:hAnsi="BRH Malayalam Extra" w:cs="BRH Malayalam Extra"/>
@@ -3580,7 +4054,25 @@
                 <w:sz w:val="32"/>
                 <w:szCs w:val="40"/>
               </w:rPr>
-              <w:t>)-  s¡ | d</w:t>
+              <w:t>)</w:t>
+            </w:r>
+            <w:proofErr w:type="gramStart"/>
+            <w:r>
+              <w:rPr>
+                <w:rFonts w:ascii="BRH Malayalam Extra" w:hAnsi="BRH Malayalam Extra" w:cs="BRH Malayalam Extra"/>
+                <w:sz w:val="32"/>
+                <w:szCs w:val="40"/>
+              </w:rPr>
+              <w:t>-  s</w:t>
+            </w:r>
+            <w:proofErr w:type="gramEnd"/>
+            <w:r>
+              <w:rPr>
+                <w:rFonts w:ascii="BRH Malayalam Extra" w:hAnsi="BRH Malayalam Extra" w:cs="BRH Malayalam Extra"/>
+                <w:sz w:val="32"/>
+                <w:szCs w:val="40"/>
+              </w:rPr>
+              <w:t>¡ | d</w:t>
             </w:r>
             <w:r>
               <w:rPr>
@@ -3784,7 +4276,25 @@
                 <w:sz w:val="32"/>
                 <w:szCs w:val="40"/>
               </w:rPr>
-              <w:t>)-  s¡ | d</w:t>
+              <w:t>)</w:t>
+            </w:r>
+            <w:proofErr w:type="gramStart"/>
+            <w:r>
+              <w:rPr>
+                <w:rFonts w:ascii="BRH Malayalam Extra" w:hAnsi="BRH Malayalam Extra" w:cs="BRH Malayalam Extra"/>
+                <w:sz w:val="32"/>
+                <w:szCs w:val="40"/>
+              </w:rPr>
+              <w:t>-  s</w:t>
+            </w:r>
+            <w:proofErr w:type="gramEnd"/>
+            <w:r>
+              <w:rPr>
+                <w:rFonts w:ascii="BRH Malayalam Extra" w:hAnsi="BRH Malayalam Extra" w:cs="BRH Malayalam Extra"/>
+                <w:sz w:val="32"/>
+                <w:szCs w:val="40"/>
+              </w:rPr>
+              <w:t>¡ | d</w:t>
             </w:r>
             <w:r>
               <w:rPr>
@@ -3993,8 +4503,18 @@
                 <w:sz w:val="32"/>
                 <w:szCs w:val="40"/>
               </w:rPr>
-              <w:t>)-  e</w:t>
-            </w:r>
+              <w:t>)</w:t>
+            </w:r>
+            <w:proofErr w:type="gramStart"/>
+            <w:r>
+              <w:rPr>
+                <w:rFonts w:ascii="BRH Malayalam Extra" w:hAnsi="BRH Malayalam Extra" w:cs="BRH Malayalam Extra"/>
+                <w:sz w:val="32"/>
+                <w:szCs w:val="40"/>
+              </w:rPr>
+              <w:t>-  e</w:t>
+            </w:r>
+            <w:proofErr w:type="gramEnd"/>
             <w:r>
               <w:rPr>
                 <w:rFonts w:ascii="BRH Malayalam Extra" w:hAnsi="BRH Malayalam Extra" w:cs="BRH Malayalam Extra"/>
@@ -4308,7 +4828,25 @@
                 <w:sz w:val="32"/>
                 <w:szCs w:val="40"/>
               </w:rPr>
-              <w:t>)-  s¡</w:t>
+              <w:t>)</w:t>
+            </w:r>
+            <w:proofErr w:type="gramStart"/>
+            <w:r>
+              <w:rPr>
+                <w:rFonts w:ascii="BRH Malayalam Extra" w:hAnsi="BRH Malayalam Extra" w:cs="BRH Malayalam Extra"/>
+                <w:sz w:val="32"/>
+                <w:szCs w:val="40"/>
+              </w:rPr>
+              <w:t>-  s</w:t>
+            </w:r>
+            <w:proofErr w:type="gramEnd"/>
+            <w:r>
+              <w:rPr>
+                <w:rFonts w:ascii="BRH Malayalam Extra" w:hAnsi="BRH Malayalam Extra" w:cs="BRH Malayalam Extra"/>
+                <w:sz w:val="32"/>
+                <w:szCs w:val="40"/>
+              </w:rPr>
+              <w:t>¡</w:t>
             </w:r>
             <w:r>
               <w:rPr>
@@ -4547,7 +5085,25 @@
                 <w:sz w:val="32"/>
                 <w:szCs w:val="40"/>
               </w:rPr>
-              <w:t>)-  s¡</w:t>
+              <w:t>)</w:t>
+            </w:r>
+            <w:proofErr w:type="gramStart"/>
+            <w:r>
+              <w:rPr>
+                <w:rFonts w:ascii="BRH Malayalam Extra" w:hAnsi="BRH Malayalam Extra" w:cs="BRH Malayalam Extra"/>
+                <w:sz w:val="32"/>
+                <w:szCs w:val="40"/>
+              </w:rPr>
+              <w:t>-  s</w:t>
+            </w:r>
+            <w:proofErr w:type="gramEnd"/>
+            <w:r>
+              <w:rPr>
+                <w:rFonts w:ascii="BRH Malayalam Extra" w:hAnsi="BRH Malayalam Extra" w:cs="BRH Malayalam Extra"/>
+                <w:sz w:val="32"/>
+                <w:szCs w:val="40"/>
+              </w:rPr>
+              <w:t>¡</w:t>
             </w:r>
             <w:r>
               <w:rPr>
@@ -4775,8 +5331,18 @@
                 <w:sz w:val="32"/>
                 <w:szCs w:val="40"/>
               </w:rPr>
-              <w:t>)-  e</w:t>
-            </w:r>
+              <w:t>)</w:t>
+            </w:r>
+            <w:proofErr w:type="gramStart"/>
+            <w:r>
+              <w:rPr>
+                <w:rFonts w:ascii="BRH Malayalam Extra" w:hAnsi="BRH Malayalam Extra" w:cs="BRH Malayalam Extra"/>
+                <w:sz w:val="32"/>
+                <w:szCs w:val="40"/>
+              </w:rPr>
+              <w:t>-  e</w:t>
+            </w:r>
+            <w:proofErr w:type="gramEnd"/>
             <w:r>
               <w:rPr>
                 <w:rFonts w:ascii="BRH Malayalam Extra" w:hAnsi="BRH Malayalam Extra" w:cs="BRH Malayalam Extra"/>
@@ -5056,7 +5622,25 @@
                 <w:sz w:val="32"/>
                 <w:szCs w:val="40"/>
               </w:rPr>
-              <w:t>)-  s¡</w:t>
+              <w:t>)</w:t>
+            </w:r>
+            <w:proofErr w:type="gramStart"/>
+            <w:r>
+              <w:rPr>
+                <w:rFonts w:ascii="BRH Malayalam Extra" w:hAnsi="BRH Malayalam Extra" w:cs="BRH Malayalam Extra"/>
+                <w:sz w:val="32"/>
+                <w:szCs w:val="40"/>
+              </w:rPr>
+              <w:t>-  s</w:t>
+            </w:r>
+            <w:proofErr w:type="gramEnd"/>
+            <w:r>
+              <w:rPr>
+                <w:rFonts w:ascii="BRH Malayalam Extra" w:hAnsi="BRH Malayalam Extra" w:cs="BRH Malayalam Extra"/>
+                <w:sz w:val="32"/>
+                <w:szCs w:val="40"/>
+              </w:rPr>
+              <w:t>¡</w:t>
             </w:r>
             <w:r>
               <w:rPr>
@@ -5297,7 +5881,25 @@
                 <w:sz w:val="32"/>
                 <w:szCs w:val="40"/>
               </w:rPr>
-              <w:t>)-  s¡</w:t>
+              <w:t>)</w:t>
+            </w:r>
+            <w:proofErr w:type="gramStart"/>
+            <w:r>
+              <w:rPr>
+                <w:rFonts w:ascii="BRH Malayalam Extra" w:hAnsi="BRH Malayalam Extra" w:cs="BRH Malayalam Extra"/>
+                <w:sz w:val="32"/>
+                <w:szCs w:val="40"/>
+              </w:rPr>
+              <w:t>-  s</w:t>
+            </w:r>
+            <w:proofErr w:type="gramEnd"/>
+            <w:r>
+              <w:rPr>
+                <w:rFonts w:ascii="BRH Malayalam Extra" w:hAnsi="BRH Malayalam Extra" w:cs="BRH Malayalam Extra"/>
+                <w:sz w:val="32"/>
+                <w:szCs w:val="40"/>
+              </w:rPr>
+              <w:t>¡</w:t>
             </w:r>
             <w:r>
               <w:rPr>
@@ -8843,7 +9445,25 @@
                 <w:sz w:val="32"/>
                 <w:szCs w:val="40"/>
               </w:rPr>
-              <w:t>)-  CöÉx—j | A</w:t>
+              <w:t>)</w:t>
+            </w:r>
+            <w:proofErr w:type="gramStart"/>
+            <w:r>
+              <w:rPr>
+                <w:rFonts w:ascii="BRH Malayalam Extra" w:hAnsi="BRH Malayalam Extra" w:cs="BRH Malayalam Extra"/>
+                <w:sz w:val="32"/>
+                <w:szCs w:val="40"/>
+              </w:rPr>
+              <w:t>-  CöÉx</w:t>
+            </w:r>
+            <w:proofErr w:type="gramEnd"/>
+            <w:r>
+              <w:rPr>
+                <w:rFonts w:ascii="BRH Malayalam Extra" w:hAnsi="BRH Malayalam Extra" w:cs="BRH Malayalam Extra"/>
+                <w:sz w:val="32"/>
+                <w:szCs w:val="40"/>
+              </w:rPr>
+              <w:t>—j | A</w:t>
             </w:r>
             <w:r>
               <w:rPr>
@@ -8913,7 +9533,25 @@
                 <w:sz w:val="32"/>
                 <w:szCs w:val="40"/>
               </w:rPr>
-              <w:t>CöÉx—jx (³§)¥tx</w:t>
+              <w:t>CöÉx—jx (³</w:t>
+            </w:r>
+            <w:proofErr w:type="gramStart"/>
+            <w:r>
+              <w:rPr>
+                <w:rFonts w:ascii="BRH Malayalam Extra" w:hAnsi="BRH Malayalam Extra" w:cs="BRH Malayalam Extra"/>
+                <w:sz w:val="32"/>
+                <w:szCs w:val="40"/>
+              </w:rPr>
+              <w:t>§)¥</w:t>
+            </w:r>
+            <w:proofErr w:type="gramEnd"/>
+            <w:r>
+              <w:rPr>
+                <w:rFonts w:ascii="BRH Malayalam Extra" w:hAnsi="BRH Malayalam Extra" w:cs="BRH Malayalam Extra"/>
+                <w:sz w:val="32"/>
+                <w:szCs w:val="40"/>
+              </w:rPr>
+              <w:t>tx</w:t>
             </w:r>
             <w:r>
               <w:rPr>
@@ -8938,8 +9576,19 @@
                 <w:szCs w:val="40"/>
                 <w:highlight w:val="yellow"/>
               </w:rPr>
-              <w:t>P˜ „(³§)¥</w:t>
-            </w:r>
+              <w:t>P˜ „(³</w:t>
+            </w:r>
+            <w:proofErr w:type="gramStart"/>
+            <w:r>
+              <w:rPr>
+                <w:rFonts w:ascii="BRH Malayalam Extra" w:hAnsi="BRH Malayalam Extra" w:cs="BRH Malayalam Extra"/>
+                <w:sz w:val="32"/>
+                <w:szCs w:val="40"/>
+                <w:highlight w:val="yellow"/>
+              </w:rPr>
+              <w:t>§)¥</w:t>
+            </w:r>
+            <w:proofErr w:type="gramEnd"/>
             <w:r>
               <w:rPr>
                 <w:rFonts w:ascii="BRH Malayalam Extra" w:hAnsi="BRH Malayalam Extra" w:cs="BRH Malayalam Extra"/>
@@ -8994,7 +9643,25 @@
                 <w:sz w:val="32"/>
                 <w:szCs w:val="40"/>
               </w:rPr>
-              <w:t xml:space="preserve"> ¥jöÉx—jx (³§)¥tx</w:t>
+              <w:t xml:space="preserve"> ¥jöÉx—jx (³</w:t>
+            </w:r>
+            <w:proofErr w:type="gramStart"/>
+            <w:r>
+              <w:rPr>
+                <w:rFonts w:ascii="BRH Malayalam Extra" w:hAnsi="BRH Malayalam Extra" w:cs="BRH Malayalam Extra"/>
+                <w:sz w:val="32"/>
+                <w:szCs w:val="40"/>
+              </w:rPr>
+              <w:t>§)¥</w:t>
+            </w:r>
+            <w:proofErr w:type="gramEnd"/>
+            <w:r>
+              <w:rPr>
+                <w:rFonts w:ascii="BRH Malayalam Extra" w:hAnsi="BRH Malayalam Extra" w:cs="BRH Malayalam Extra"/>
+                <w:sz w:val="32"/>
+                <w:szCs w:val="40"/>
+              </w:rPr>
+              <w:t>tx</w:t>
             </w:r>
             <w:r>
               <w:rPr>
@@ -9123,8 +9790,18 @@
                 <w:sz w:val="32"/>
                 <w:szCs w:val="40"/>
               </w:rPr>
-              <w:t>)-  A</w:t>
-            </w:r>
+              <w:t>)</w:t>
+            </w:r>
+            <w:proofErr w:type="gramStart"/>
+            <w:r>
+              <w:rPr>
+                <w:rFonts w:ascii="BRH Malayalam Extra" w:hAnsi="BRH Malayalam Extra" w:cs="BRH Malayalam Extra"/>
+                <w:sz w:val="32"/>
+                <w:szCs w:val="40"/>
+              </w:rPr>
+              <w:t>-  A</w:t>
+            </w:r>
+            <w:proofErr w:type="gramEnd"/>
             <w:r>
               <w:rPr>
                 <w:rFonts w:ascii="BRH Malayalam Extra" w:hAnsi="BRH Malayalam Extra" w:cs="BRH Malayalam Extra"/>
@@ -9314,8 +9991,19 @@
                 <w:szCs w:val="40"/>
                 <w:highlight w:val="yellow"/>
               </w:rPr>
-              <w:t>¡¥P˜ „(³§)¥</w:t>
-            </w:r>
+              <w:t>¡¥P˜ „(³</w:t>
+            </w:r>
+            <w:proofErr w:type="gramStart"/>
+            <w:r>
+              <w:rPr>
+                <w:rFonts w:ascii="BRH Malayalam Extra" w:hAnsi="BRH Malayalam Extra" w:cs="BRH Malayalam Extra"/>
+                <w:sz w:val="32"/>
+                <w:szCs w:val="40"/>
+                <w:highlight w:val="yellow"/>
+              </w:rPr>
+              <w:t>§)¥</w:t>
+            </w:r>
+            <w:proofErr w:type="gramEnd"/>
             <w:r>
               <w:rPr>
                 <w:rFonts w:ascii="BRH Malayalam Extra" w:hAnsi="BRH Malayalam Extra" w:cs="BRH Malayalam Extra"/>
@@ -9491,7 +10179,25 @@
                 <w:sz w:val="32"/>
                 <w:szCs w:val="40"/>
               </w:rPr>
-              <w:t>)-  CöÉx—j | A</w:t>
+              <w:t>)</w:t>
+            </w:r>
+            <w:proofErr w:type="gramStart"/>
+            <w:r>
+              <w:rPr>
+                <w:rFonts w:ascii="BRH Malayalam Extra" w:hAnsi="BRH Malayalam Extra" w:cs="BRH Malayalam Extra"/>
+                <w:sz w:val="32"/>
+                <w:szCs w:val="40"/>
+              </w:rPr>
+              <w:t>-  CöÉx</w:t>
+            </w:r>
+            <w:proofErr w:type="gramEnd"/>
+            <w:r>
+              <w:rPr>
+                <w:rFonts w:ascii="BRH Malayalam Extra" w:hAnsi="BRH Malayalam Extra" w:cs="BRH Malayalam Extra"/>
+                <w:sz w:val="32"/>
+                <w:szCs w:val="40"/>
+              </w:rPr>
+              <w:t>—j | A</w:t>
             </w:r>
             <w:r>
               <w:rPr>
@@ -9561,7 +10267,25 @@
                 <w:sz w:val="32"/>
                 <w:szCs w:val="40"/>
               </w:rPr>
-              <w:t>CöÉx—jx (³§)¥tx</w:t>
+              <w:t>CöÉx—jx (³</w:t>
+            </w:r>
+            <w:proofErr w:type="gramStart"/>
+            <w:r>
+              <w:rPr>
+                <w:rFonts w:ascii="BRH Malayalam Extra" w:hAnsi="BRH Malayalam Extra" w:cs="BRH Malayalam Extra"/>
+                <w:sz w:val="32"/>
+                <w:szCs w:val="40"/>
+              </w:rPr>
+              <w:t>§)¥</w:t>
+            </w:r>
+            <w:proofErr w:type="gramEnd"/>
+            <w:r>
+              <w:rPr>
+                <w:rFonts w:ascii="BRH Malayalam Extra" w:hAnsi="BRH Malayalam Extra" w:cs="BRH Malayalam Extra"/>
+                <w:sz w:val="32"/>
+                <w:szCs w:val="40"/>
+              </w:rPr>
+              <w:t>tx</w:t>
             </w:r>
             <w:r>
               <w:rPr>
@@ -9664,7 +10388,25 @@
                 <w:sz w:val="32"/>
                 <w:szCs w:val="40"/>
               </w:rPr>
-              <w:t>¥jöÉx—jx (³§)¥tx</w:t>
+              <w:t>¥jöÉx—jx (³</w:t>
+            </w:r>
+            <w:proofErr w:type="gramStart"/>
+            <w:r>
+              <w:rPr>
+                <w:rFonts w:ascii="BRH Malayalam Extra" w:hAnsi="BRH Malayalam Extra" w:cs="BRH Malayalam Extra"/>
+                <w:sz w:val="32"/>
+                <w:szCs w:val="40"/>
+              </w:rPr>
+              <w:t>§)¥</w:t>
+            </w:r>
+            <w:proofErr w:type="gramEnd"/>
+            <w:r>
+              <w:rPr>
+                <w:rFonts w:ascii="BRH Malayalam Extra" w:hAnsi="BRH Malayalam Extra" w:cs="BRH Malayalam Extra"/>
+                <w:sz w:val="32"/>
+                <w:szCs w:val="40"/>
+              </w:rPr>
+              <w:t>tx</w:t>
             </w:r>
             <w:r>
               <w:rPr>
@@ -9793,8 +10535,18 @@
                 <w:sz w:val="32"/>
                 <w:szCs w:val="40"/>
               </w:rPr>
-              <w:t>)-  A</w:t>
-            </w:r>
+              <w:t>)</w:t>
+            </w:r>
+            <w:proofErr w:type="gramStart"/>
+            <w:r>
+              <w:rPr>
+                <w:rFonts w:ascii="BRH Malayalam Extra" w:hAnsi="BRH Malayalam Extra" w:cs="BRH Malayalam Extra"/>
+                <w:sz w:val="32"/>
+                <w:szCs w:val="40"/>
+              </w:rPr>
+              <w:t>-  A</w:t>
+            </w:r>
+            <w:proofErr w:type="gramEnd"/>
             <w:r>
               <w:rPr>
                 <w:rFonts w:ascii="BRH Malayalam Extra" w:hAnsi="BRH Malayalam Extra" w:cs="BRH Malayalam Extra"/>
@@ -10166,7 +10918,25 @@
                 <w:sz w:val="32"/>
                 <w:szCs w:val="40"/>
               </w:rPr>
-              <w:t>)-  Bpy—¥Ë |</w:t>
+              <w:t>)</w:t>
+            </w:r>
+            <w:proofErr w:type="gramStart"/>
+            <w:r>
+              <w:rPr>
+                <w:rFonts w:ascii="BRH Malayalam Extra" w:hAnsi="BRH Malayalam Extra" w:cs="BRH Malayalam Extra"/>
+                <w:sz w:val="32"/>
+                <w:szCs w:val="40"/>
+              </w:rPr>
+              <w:t>-  Bpy</w:t>
+            </w:r>
+            <w:proofErr w:type="gramEnd"/>
+            <w:r>
+              <w:rPr>
+                <w:rFonts w:ascii="BRH Malayalam Extra" w:hAnsi="BRH Malayalam Extra" w:cs="BRH Malayalam Extra"/>
+                <w:sz w:val="32"/>
+                <w:szCs w:val="40"/>
+              </w:rPr>
+              <w:t>—¥Ë |</w:t>
             </w:r>
           </w:p>
           <w:p>
@@ -10344,7 +11114,25 @@
                 <w:sz w:val="32"/>
                 <w:szCs w:val="40"/>
               </w:rPr>
-              <w:t>)-  Bpy—¥Ë |</w:t>
+              <w:t>)</w:t>
+            </w:r>
+            <w:proofErr w:type="gramStart"/>
+            <w:r>
+              <w:rPr>
+                <w:rFonts w:ascii="BRH Malayalam Extra" w:hAnsi="BRH Malayalam Extra" w:cs="BRH Malayalam Extra"/>
+                <w:sz w:val="32"/>
+                <w:szCs w:val="40"/>
+              </w:rPr>
+              <w:t>-  Bpy</w:t>
+            </w:r>
+            <w:proofErr w:type="gramEnd"/>
+            <w:r>
+              <w:rPr>
+                <w:rFonts w:ascii="BRH Malayalam Extra" w:hAnsi="BRH Malayalam Extra" w:cs="BRH Malayalam Extra"/>
+                <w:sz w:val="32"/>
+                <w:szCs w:val="40"/>
+              </w:rPr>
+              <w:t>—¥Ë |</w:t>
             </w:r>
           </w:p>
           <w:p>
@@ -10547,7 +11335,25 @@
                 <w:sz w:val="32"/>
                 <w:szCs w:val="40"/>
               </w:rPr>
-              <w:t>)-  Aj—sþ§a¢Y¦ |</w:t>
+              <w:t>)</w:t>
+            </w:r>
+            <w:proofErr w:type="gramStart"/>
+            <w:r>
+              <w:rPr>
+                <w:rFonts w:ascii="BRH Malayalam Extra" w:hAnsi="BRH Malayalam Extra" w:cs="BRH Malayalam Extra"/>
+                <w:sz w:val="32"/>
+                <w:szCs w:val="40"/>
+              </w:rPr>
+              <w:t>-  Aj</w:t>
+            </w:r>
+            <w:proofErr w:type="gramEnd"/>
+            <w:r>
+              <w:rPr>
+                <w:rFonts w:ascii="BRH Malayalam Extra" w:hAnsi="BRH Malayalam Extra" w:cs="BRH Malayalam Extra"/>
+                <w:sz w:val="32"/>
+                <w:szCs w:val="40"/>
+              </w:rPr>
+              <w:t>—sþ§a¢Y¦ |</w:t>
             </w:r>
           </w:p>
           <w:p>
@@ -10757,7 +11563,25 @@
                 <w:sz w:val="32"/>
                 <w:szCs w:val="40"/>
               </w:rPr>
-              <w:t>)-  Aj—sþ§a¢Y¦ |</w:t>
+              <w:t>)</w:t>
+            </w:r>
+            <w:proofErr w:type="gramStart"/>
+            <w:r>
+              <w:rPr>
+                <w:rFonts w:ascii="BRH Malayalam Extra" w:hAnsi="BRH Malayalam Extra" w:cs="BRH Malayalam Extra"/>
+                <w:sz w:val="32"/>
+                <w:szCs w:val="40"/>
+              </w:rPr>
+              <w:t>-  Aj</w:t>
+            </w:r>
+            <w:proofErr w:type="gramEnd"/>
+            <w:r>
+              <w:rPr>
+                <w:rFonts w:ascii="BRH Malayalam Extra" w:hAnsi="BRH Malayalam Extra" w:cs="BRH Malayalam Extra"/>
+                <w:sz w:val="32"/>
+                <w:szCs w:val="40"/>
+              </w:rPr>
+              <w:t>—sþ§a¢Y¦ |</w:t>
             </w:r>
           </w:p>
           <w:p>
@@ -10983,7 +11807,25 @@
                 <w:sz w:val="32"/>
                 <w:szCs w:val="40"/>
               </w:rPr>
-              <w:t>)-  Dby—Z¦ |</w:t>
+              <w:t>)</w:t>
+            </w:r>
+            <w:proofErr w:type="gramStart"/>
+            <w:r>
+              <w:rPr>
+                <w:rFonts w:ascii="BRH Malayalam Extra" w:hAnsi="BRH Malayalam Extra" w:cs="BRH Malayalam Extra"/>
+                <w:sz w:val="32"/>
+                <w:szCs w:val="40"/>
+              </w:rPr>
+              <w:t>-  Dby</w:t>
+            </w:r>
+            <w:proofErr w:type="gramEnd"/>
+            <w:r>
+              <w:rPr>
+                <w:rFonts w:ascii="BRH Malayalam Extra" w:hAnsi="BRH Malayalam Extra" w:cs="BRH Malayalam Extra"/>
+                <w:sz w:val="32"/>
+                <w:szCs w:val="40"/>
+              </w:rPr>
+              <w:t>—Z¦ |</w:t>
             </w:r>
           </w:p>
           <w:p>
@@ -11193,7 +12035,25 @@
                 <w:sz w:val="32"/>
                 <w:szCs w:val="40"/>
               </w:rPr>
-              <w:t>)-  Dby—Z¦ |</w:t>
+              <w:t>)</w:t>
+            </w:r>
+            <w:proofErr w:type="gramStart"/>
+            <w:r>
+              <w:rPr>
+                <w:rFonts w:ascii="BRH Malayalam Extra" w:hAnsi="BRH Malayalam Extra" w:cs="BRH Malayalam Extra"/>
+                <w:sz w:val="32"/>
+                <w:szCs w:val="40"/>
+              </w:rPr>
+              <w:t>-  Dby</w:t>
+            </w:r>
+            <w:proofErr w:type="gramEnd"/>
+            <w:r>
+              <w:rPr>
+                <w:rFonts w:ascii="BRH Malayalam Extra" w:hAnsi="BRH Malayalam Extra" w:cs="BRH Malayalam Extra"/>
+                <w:sz w:val="32"/>
+                <w:szCs w:val="40"/>
+              </w:rPr>
+              <w:t>—Z¦ |</w:t>
             </w:r>
           </w:p>
           <w:p>
@@ -11417,7 +12277,25 @@
                 <w:sz w:val="32"/>
                 <w:szCs w:val="40"/>
               </w:rPr>
-              <w:t>)-  ps¡—J | A</w:t>
+              <w:t>)</w:t>
+            </w:r>
+            <w:proofErr w:type="gramStart"/>
+            <w:r>
+              <w:rPr>
+                <w:rFonts w:ascii="BRH Malayalam Extra" w:hAnsi="BRH Malayalam Extra" w:cs="BRH Malayalam Extra"/>
+                <w:sz w:val="32"/>
+                <w:szCs w:val="40"/>
+              </w:rPr>
+              <w:t>-  ps</w:t>
+            </w:r>
+            <w:proofErr w:type="gramEnd"/>
+            <w:r>
+              <w:rPr>
+                <w:rFonts w:ascii="BRH Malayalam Extra" w:hAnsi="BRH Malayalam Extra" w:cs="BRH Malayalam Extra"/>
+                <w:sz w:val="32"/>
+                <w:szCs w:val="40"/>
+              </w:rPr>
+              <w:t>¡—J | A</w:t>
             </w:r>
             <w:r>
               <w:rPr>
@@ -11725,8 +12603,18 @@
                 <w:sz w:val="32"/>
                 <w:szCs w:val="40"/>
               </w:rPr>
-              <w:t>)-  A</w:t>
-            </w:r>
+              <w:t>)</w:t>
+            </w:r>
+            <w:proofErr w:type="gramStart"/>
+            <w:r>
+              <w:rPr>
+                <w:rFonts w:ascii="BRH Malayalam Extra" w:hAnsi="BRH Malayalam Extra" w:cs="BRH Malayalam Extra"/>
+                <w:sz w:val="32"/>
+                <w:szCs w:val="40"/>
+              </w:rPr>
+              <w:t>-  A</w:t>
+            </w:r>
+            <w:proofErr w:type="gramEnd"/>
             <w:r>
               <w:rPr>
                 <w:rFonts w:ascii="BRH Malayalam Extra" w:hAnsi="BRH Malayalam Extra" w:cs="BRH Malayalam Extra"/>
@@ -12090,8 +12978,18 @@
                 <w:sz w:val="32"/>
                 <w:szCs w:val="40"/>
               </w:rPr>
-              <w:t>)-  A</w:t>
-            </w:r>
+              <w:t>)</w:t>
+            </w:r>
+            <w:proofErr w:type="gramStart"/>
+            <w:r>
+              <w:rPr>
+                <w:rFonts w:ascii="BRH Malayalam Extra" w:hAnsi="BRH Malayalam Extra" w:cs="BRH Malayalam Extra"/>
+                <w:sz w:val="32"/>
+                <w:szCs w:val="40"/>
+              </w:rPr>
+              <w:t>-  A</w:t>
+            </w:r>
+            <w:proofErr w:type="gramEnd"/>
             <w:r>
               <w:rPr>
                 <w:rFonts w:ascii="BRH Malayalam Extra" w:hAnsi="BRH Malayalam Extra" w:cs="BRH Malayalam Extra"/>
@@ -12361,7 +13259,25 @@
                 <w:sz w:val="32"/>
                 <w:szCs w:val="40"/>
               </w:rPr>
-              <w:t>)-  ps¡—J | A</w:t>
+              <w:t>)</w:t>
+            </w:r>
+            <w:proofErr w:type="gramStart"/>
+            <w:r>
+              <w:rPr>
+                <w:rFonts w:ascii="BRH Malayalam Extra" w:hAnsi="BRH Malayalam Extra" w:cs="BRH Malayalam Extra"/>
+                <w:sz w:val="32"/>
+                <w:szCs w:val="40"/>
+              </w:rPr>
+              <w:t>-  ps</w:t>
+            </w:r>
+            <w:proofErr w:type="gramEnd"/>
+            <w:r>
+              <w:rPr>
+                <w:rFonts w:ascii="BRH Malayalam Extra" w:hAnsi="BRH Malayalam Extra" w:cs="BRH Malayalam Extra"/>
+                <w:sz w:val="32"/>
+                <w:szCs w:val="40"/>
+              </w:rPr>
+              <w:t>¡—J | A</w:t>
             </w:r>
             <w:r>
               <w:rPr>
@@ -12661,8 +13577,18 @@
                 <w:sz w:val="32"/>
                 <w:szCs w:val="40"/>
               </w:rPr>
-              <w:t>)-  A</w:t>
-            </w:r>
+              <w:t>)</w:t>
+            </w:r>
+            <w:proofErr w:type="gramStart"/>
+            <w:r>
+              <w:rPr>
+                <w:rFonts w:ascii="BRH Malayalam Extra" w:hAnsi="BRH Malayalam Extra" w:cs="BRH Malayalam Extra"/>
+                <w:sz w:val="32"/>
+                <w:szCs w:val="40"/>
+              </w:rPr>
+              <w:t>-  A</w:t>
+            </w:r>
+            <w:proofErr w:type="gramEnd"/>
             <w:r>
               <w:rPr>
                 <w:rFonts w:ascii="BRH Malayalam Extra" w:hAnsi="BRH Malayalam Extra" w:cs="BRH Malayalam Extra"/>
@@ -13032,8 +13958,18 @@
                 <w:sz w:val="32"/>
                 <w:szCs w:val="40"/>
               </w:rPr>
-              <w:t>)-  A</w:t>
-            </w:r>
+              <w:t>)</w:t>
+            </w:r>
+            <w:proofErr w:type="gramStart"/>
+            <w:r>
+              <w:rPr>
+                <w:rFonts w:ascii="BRH Malayalam Extra" w:hAnsi="BRH Malayalam Extra" w:cs="BRH Malayalam Extra"/>
+                <w:sz w:val="32"/>
+                <w:szCs w:val="40"/>
+              </w:rPr>
+              <w:t>-  A</w:t>
+            </w:r>
+            <w:proofErr w:type="gramEnd"/>
             <w:r>
               <w:rPr>
                 <w:rFonts w:ascii="BRH Malayalam Extra" w:hAnsi="BRH Malayalam Extra" w:cs="BRH Malayalam Extra"/>
@@ -13339,8 +14275,18 @@
                 <w:sz w:val="32"/>
                 <w:szCs w:val="40"/>
               </w:rPr>
-              <w:t>)-  ey</w:t>
-            </w:r>
+              <w:t>)</w:t>
+            </w:r>
+            <w:proofErr w:type="gramStart"/>
+            <w:r>
+              <w:rPr>
+                <w:rFonts w:ascii="BRH Malayalam Extra" w:hAnsi="BRH Malayalam Extra" w:cs="BRH Malayalam Extra"/>
+                <w:sz w:val="32"/>
+                <w:szCs w:val="40"/>
+              </w:rPr>
+              <w:t>-  ey</w:t>
+            </w:r>
+            <w:proofErr w:type="gramEnd"/>
             <w:r>
               <w:rPr>
                 <w:rFonts w:ascii="BRH Malayalam Extra" w:hAnsi="BRH Malayalam Extra" w:cs="BRH Malayalam Extra"/>
@@ -13677,8 +14623,18 @@
                 <w:sz w:val="32"/>
                 <w:szCs w:val="40"/>
               </w:rPr>
-              <w:t>)-  e</w:t>
-            </w:r>
+              <w:t>)</w:t>
+            </w:r>
+            <w:proofErr w:type="gramStart"/>
+            <w:r>
+              <w:rPr>
+                <w:rFonts w:ascii="BRH Malayalam Extra" w:hAnsi="BRH Malayalam Extra" w:cs="BRH Malayalam Extra"/>
+                <w:sz w:val="32"/>
+                <w:szCs w:val="40"/>
+              </w:rPr>
+              <w:t>-  e</w:t>
+            </w:r>
+            <w:proofErr w:type="gramEnd"/>
             <w:r>
               <w:rPr>
                 <w:rFonts w:ascii="BRH Malayalam Extra" w:hAnsi="BRH Malayalam Extra" w:cs="BRH Malayalam Extra"/>
@@ -13986,8 +14942,18 @@
                 <w:sz w:val="32"/>
                 <w:szCs w:val="40"/>
               </w:rPr>
-              <w:t>)-  ey</w:t>
-            </w:r>
+              <w:t>)</w:t>
+            </w:r>
+            <w:proofErr w:type="gramStart"/>
+            <w:r>
+              <w:rPr>
+                <w:rFonts w:ascii="BRH Malayalam Extra" w:hAnsi="BRH Malayalam Extra" w:cs="BRH Malayalam Extra"/>
+                <w:sz w:val="32"/>
+                <w:szCs w:val="40"/>
+              </w:rPr>
+              <w:t>-  ey</w:t>
+            </w:r>
+            <w:proofErr w:type="gramEnd"/>
             <w:r>
               <w:rPr>
                 <w:rFonts w:ascii="BRH Malayalam Extra" w:hAnsi="BRH Malayalam Extra" w:cs="BRH Malayalam Extra"/>
@@ -14324,8 +15290,18 @@
                 <w:sz w:val="32"/>
                 <w:szCs w:val="40"/>
               </w:rPr>
-              <w:t>)-  e</w:t>
-            </w:r>
+              <w:t>)</w:t>
+            </w:r>
+            <w:proofErr w:type="gramStart"/>
+            <w:r>
+              <w:rPr>
+                <w:rFonts w:ascii="BRH Malayalam Extra" w:hAnsi="BRH Malayalam Extra" w:cs="BRH Malayalam Extra"/>
+                <w:sz w:val="32"/>
+                <w:szCs w:val="40"/>
+              </w:rPr>
+              <w:t>-  e</w:t>
+            </w:r>
+            <w:proofErr w:type="gramEnd"/>
             <w:r>
               <w:rPr>
                 <w:rFonts w:ascii="BRH Malayalam Extra" w:hAnsi="BRH Malayalam Extra" w:cs="BRH Malayalam Extra"/>
@@ -14638,8 +15614,18 @@
                 <w:sz w:val="32"/>
                 <w:szCs w:val="40"/>
               </w:rPr>
-              <w:t>)-  C</w:t>
-            </w:r>
+              <w:t>)</w:t>
+            </w:r>
+            <w:proofErr w:type="gramStart"/>
+            <w:r>
+              <w:rPr>
+                <w:rFonts w:ascii="BRH Malayalam Extra" w:hAnsi="BRH Malayalam Extra" w:cs="BRH Malayalam Extra"/>
+                <w:sz w:val="32"/>
+                <w:szCs w:val="40"/>
+              </w:rPr>
+              <w:t>-  C</w:t>
+            </w:r>
+            <w:proofErr w:type="gramEnd"/>
             <w:r>
               <w:rPr>
                 <w:rFonts w:ascii="BRH Malayalam Extra" w:hAnsi="BRH Malayalam Extra" w:cs="BRH Malayalam Extra"/>
@@ -14928,8 +15914,18 @@
                 <w:sz w:val="32"/>
                 <w:szCs w:val="40"/>
               </w:rPr>
-              <w:t>)-  C</w:t>
-            </w:r>
+              <w:t>)</w:t>
+            </w:r>
+            <w:proofErr w:type="gramStart"/>
+            <w:r>
+              <w:rPr>
+                <w:rFonts w:ascii="BRH Malayalam Extra" w:hAnsi="BRH Malayalam Extra" w:cs="BRH Malayalam Extra"/>
+                <w:sz w:val="32"/>
+                <w:szCs w:val="40"/>
+              </w:rPr>
+              <w:t>-  C</w:t>
+            </w:r>
+            <w:proofErr w:type="gramEnd"/>
             <w:r>
               <w:rPr>
                 <w:rFonts w:ascii="BRH Malayalam Extra" w:hAnsi="BRH Malayalam Extra" w:cs="BRH Malayalam Extra"/>
@@ -15170,8 +16166,18 @@
                 <w:sz w:val="32"/>
                 <w:szCs w:val="40"/>
               </w:rPr>
-              <w:t>)-  C</w:t>
-            </w:r>
+              <w:t>)</w:t>
+            </w:r>
+            <w:proofErr w:type="gramStart"/>
+            <w:r>
+              <w:rPr>
+                <w:rFonts w:ascii="BRH Malayalam Extra" w:hAnsi="BRH Malayalam Extra" w:cs="BRH Malayalam Extra"/>
+                <w:sz w:val="32"/>
+                <w:szCs w:val="40"/>
+              </w:rPr>
+              <w:t>-  C</w:t>
+            </w:r>
+            <w:proofErr w:type="gramEnd"/>
             <w:r>
               <w:rPr>
                 <w:rFonts w:ascii="BRH Malayalam Extra" w:hAnsi="BRH Malayalam Extra" w:cs="BRH Malayalam Extra"/>
@@ -15478,8 +16484,18 @@
                 <w:sz w:val="32"/>
                 <w:szCs w:val="40"/>
               </w:rPr>
-              <w:t>)-  C</w:t>
-            </w:r>
+              <w:t>)</w:t>
+            </w:r>
+            <w:proofErr w:type="gramStart"/>
+            <w:r>
+              <w:rPr>
+                <w:rFonts w:ascii="BRH Malayalam Extra" w:hAnsi="BRH Malayalam Extra" w:cs="BRH Malayalam Extra"/>
+                <w:sz w:val="32"/>
+                <w:szCs w:val="40"/>
+              </w:rPr>
+              <w:t>-  C</w:t>
+            </w:r>
+            <w:proofErr w:type="gramEnd"/>
             <w:r>
               <w:rPr>
                 <w:rFonts w:ascii="BRH Malayalam Extra" w:hAnsi="BRH Malayalam Extra" w:cs="BRH Malayalam Extra"/>
@@ -15725,7 +16741,25 @@
                 <w:sz w:val="32"/>
                 <w:szCs w:val="40"/>
               </w:rPr>
-              <w:t>)-  ¥sxix—</w:t>
+              <w:t>)</w:t>
+            </w:r>
+            <w:proofErr w:type="gramStart"/>
+            <w:r>
+              <w:rPr>
+                <w:rFonts w:ascii="BRH Malayalam Extra" w:hAnsi="BRH Malayalam Extra" w:cs="BRH Malayalam Extra"/>
+                <w:sz w:val="32"/>
+                <w:szCs w:val="40"/>
+              </w:rPr>
+              <w:t>-  ¥</w:t>
+            </w:r>
+            <w:proofErr w:type="gramEnd"/>
+            <w:r>
+              <w:rPr>
+                <w:rFonts w:ascii="BRH Malayalam Extra" w:hAnsi="BRH Malayalam Extra" w:cs="BRH Malayalam Extra"/>
+                <w:sz w:val="32"/>
+                <w:szCs w:val="40"/>
+              </w:rPr>
+              <w:t>sxix—</w:t>
             </w:r>
             <w:r>
               <w:rPr>
@@ -15960,7 +16994,25 @@
                 <w:sz w:val="32"/>
                 <w:szCs w:val="40"/>
               </w:rPr>
-              <w:t>)-  ¥sxix—</w:t>
+              <w:t>)</w:t>
+            </w:r>
+            <w:proofErr w:type="gramStart"/>
+            <w:r>
+              <w:rPr>
+                <w:rFonts w:ascii="BRH Malayalam Extra" w:hAnsi="BRH Malayalam Extra" w:cs="BRH Malayalam Extra"/>
+                <w:sz w:val="32"/>
+                <w:szCs w:val="40"/>
+              </w:rPr>
+              <w:t>-  ¥</w:t>
+            </w:r>
+            <w:proofErr w:type="gramEnd"/>
+            <w:r>
+              <w:rPr>
+                <w:rFonts w:ascii="BRH Malayalam Extra" w:hAnsi="BRH Malayalam Extra" w:cs="BRH Malayalam Extra"/>
+                <w:sz w:val="32"/>
+                <w:szCs w:val="40"/>
+              </w:rPr>
+              <w:t>sxix—</w:t>
             </w:r>
             <w:r>
               <w:rPr>
@@ -16194,7 +17246,25 @@
                 <w:sz w:val="32"/>
                 <w:szCs w:val="40"/>
               </w:rPr>
-              <w:t>)-  ¥sxix—</w:t>
+              <w:t>)</w:t>
+            </w:r>
+            <w:proofErr w:type="gramStart"/>
+            <w:r>
+              <w:rPr>
+                <w:rFonts w:ascii="BRH Malayalam Extra" w:hAnsi="BRH Malayalam Extra" w:cs="BRH Malayalam Extra"/>
+                <w:sz w:val="32"/>
+                <w:szCs w:val="40"/>
+              </w:rPr>
+              <w:t>-  ¥</w:t>
+            </w:r>
+            <w:proofErr w:type="gramEnd"/>
+            <w:r>
+              <w:rPr>
+                <w:rFonts w:ascii="BRH Malayalam Extra" w:hAnsi="BRH Malayalam Extra" w:cs="BRH Malayalam Extra"/>
+                <w:sz w:val="32"/>
+                <w:szCs w:val="40"/>
+              </w:rPr>
+              <w:t>sxix—</w:t>
             </w:r>
             <w:r>
               <w:rPr>
@@ -16421,7 +17491,25 @@
                 <w:sz w:val="32"/>
                 <w:szCs w:val="40"/>
               </w:rPr>
-              <w:t>)-  ¥sxix—</w:t>
+              <w:t>)</w:t>
+            </w:r>
+            <w:proofErr w:type="gramStart"/>
+            <w:r>
+              <w:rPr>
+                <w:rFonts w:ascii="BRH Malayalam Extra" w:hAnsi="BRH Malayalam Extra" w:cs="BRH Malayalam Extra"/>
+                <w:sz w:val="32"/>
+                <w:szCs w:val="40"/>
+              </w:rPr>
+              <w:t>-  ¥</w:t>
+            </w:r>
+            <w:proofErr w:type="gramEnd"/>
+            <w:r>
+              <w:rPr>
+                <w:rFonts w:ascii="BRH Malayalam Extra" w:hAnsi="BRH Malayalam Extra" w:cs="BRH Malayalam Extra"/>
+                <w:sz w:val="32"/>
+                <w:szCs w:val="40"/>
+              </w:rPr>
+              <w:t>sxix—</w:t>
             </w:r>
             <w:r>
               <w:rPr>
@@ -16653,7 +17741,25 @@
                 <w:sz w:val="32"/>
                 <w:szCs w:val="40"/>
               </w:rPr>
-              <w:t>)-  ¥sxix—</w:t>
+              <w:t>)</w:t>
+            </w:r>
+            <w:proofErr w:type="gramStart"/>
+            <w:r>
+              <w:rPr>
+                <w:rFonts w:ascii="BRH Malayalam Extra" w:hAnsi="BRH Malayalam Extra" w:cs="BRH Malayalam Extra"/>
+                <w:sz w:val="32"/>
+                <w:szCs w:val="40"/>
+              </w:rPr>
+              <w:t>-  ¥</w:t>
+            </w:r>
+            <w:proofErr w:type="gramEnd"/>
+            <w:r>
+              <w:rPr>
+                <w:rFonts w:ascii="BRH Malayalam Extra" w:hAnsi="BRH Malayalam Extra" w:cs="BRH Malayalam Extra"/>
+                <w:sz w:val="32"/>
+                <w:szCs w:val="40"/>
+              </w:rPr>
+              <w:t>sxix—</w:t>
             </w:r>
             <w:r>
               <w:rPr>
@@ -16995,7 +18101,25 @@
                 <w:sz w:val="32"/>
                 <w:szCs w:val="40"/>
               </w:rPr>
-              <w:t>)-  ¥sxix—</w:t>
+              <w:t>)</w:t>
+            </w:r>
+            <w:proofErr w:type="gramStart"/>
+            <w:r>
+              <w:rPr>
+                <w:rFonts w:ascii="BRH Malayalam Extra" w:hAnsi="BRH Malayalam Extra" w:cs="BRH Malayalam Extra"/>
+                <w:sz w:val="32"/>
+                <w:szCs w:val="40"/>
+              </w:rPr>
+              <w:t>-  ¥</w:t>
+            </w:r>
+            <w:proofErr w:type="gramEnd"/>
+            <w:r>
+              <w:rPr>
+                <w:rFonts w:ascii="BRH Malayalam Extra" w:hAnsi="BRH Malayalam Extra" w:cs="BRH Malayalam Extra"/>
+                <w:sz w:val="32"/>
+                <w:szCs w:val="40"/>
+              </w:rPr>
+              <w:t>sxix—</w:t>
             </w:r>
             <w:r>
               <w:rPr>
@@ -17221,7 +18345,25 @@
                 <w:sz w:val="32"/>
                 <w:szCs w:val="40"/>
               </w:rPr>
-              <w:t>)-  ¥sxix—</w:t>
+              <w:t>)</w:t>
+            </w:r>
+            <w:proofErr w:type="gramStart"/>
+            <w:r>
+              <w:rPr>
+                <w:rFonts w:ascii="BRH Malayalam Extra" w:hAnsi="BRH Malayalam Extra" w:cs="BRH Malayalam Extra"/>
+                <w:sz w:val="32"/>
+                <w:szCs w:val="40"/>
+              </w:rPr>
+              <w:t>-  ¥</w:t>
+            </w:r>
+            <w:proofErr w:type="gramEnd"/>
+            <w:r>
+              <w:rPr>
+                <w:rFonts w:ascii="BRH Malayalam Extra" w:hAnsi="BRH Malayalam Extra" w:cs="BRH Malayalam Extra"/>
+                <w:sz w:val="32"/>
+                <w:szCs w:val="40"/>
+              </w:rPr>
+              <w:t>sxix—</w:t>
             </w:r>
             <w:r>
               <w:rPr>
@@ -17547,7 +18689,25 @@
                 <w:sz w:val="32"/>
                 <w:szCs w:val="40"/>
               </w:rPr>
-              <w:t>)-  ¥sxix—</w:t>
+              <w:t>)</w:t>
+            </w:r>
+            <w:proofErr w:type="gramStart"/>
+            <w:r>
+              <w:rPr>
+                <w:rFonts w:ascii="BRH Malayalam Extra" w:hAnsi="BRH Malayalam Extra" w:cs="BRH Malayalam Extra"/>
+                <w:sz w:val="32"/>
+                <w:szCs w:val="40"/>
+              </w:rPr>
+              <w:t>-  ¥</w:t>
+            </w:r>
+            <w:proofErr w:type="gramEnd"/>
+            <w:r>
+              <w:rPr>
+                <w:rFonts w:ascii="BRH Malayalam Extra" w:hAnsi="BRH Malayalam Extra" w:cs="BRH Malayalam Extra"/>
+                <w:sz w:val="32"/>
+                <w:szCs w:val="40"/>
+              </w:rPr>
+              <w:t>sxix—</w:t>
             </w:r>
             <w:r>
               <w:rPr>

</xml_diff>